<commit_message>
rerun 570k parameter with old config
</commit_message>
<xml_diff>
--- a/De_xuat_phuong_phap_FL.docx
+++ b/De_xuat_phuong_phap_FL.docx
@@ -1,17 +1,36 @@
 
 <file path=word/document.xml><?xml version="1.0" encoding="utf-8"?>
-<w:document xmlns:wpc="http://schemas.microsoft.com/office/word/2010/wordprocessingCanvas" xmlns:mc="http://schemas.openxmlformats.org/markup-compatibility/2006" xmlns:o="urn:schemas-microsoft-com:office:office" xmlns:r="http://schemas.openxmlformats.org/officeDocument/2006/relationships" xmlns:m="http://schemas.openxmlformats.org/officeDocument/2006/math" xmlns:v="urn:schemas-microsoft-com:vml" xmlns:wp14="http://schemas.microsoft.com/office/word/2010/wordprocessingDrawing" xmlns:wp="http://schemas.openxmlformats.org/drawingml/2006/wordprocessingDrawing" xmlns:w10="urn:schemas-microsoft-com:office:word" xmlns:w="http://schemas.openxmlformats.org/wordprocessingml/2006/main" xmlns:w14="http://schemas.microsoft.com/office/word/2010/wordml" xmlns:w15="http://schemas.microsoft.com/office/word/2012/wordml" xmlns:w16se="http://schemas.microsoft.com/office/word/2015/wordml/symex" xmlns:w16cid="http://schemas.microsoft.com/office/word/2016/wordml/cid" xmlns:w16="http://schemas.microsoft.com/office/word/2018/wordml" xmlns:w16cex="http://schemas.microsoft.com/office/word/2018/wordml/cex" xmlns:w16sdtdh="http://schemas.microsoft.com/office/word/2020/wordml/sdtdatahash" xmlns:wne="http://schemas.microsoft.com/office/word/2006/wordml" xmlns:wpg="http://schemas.microsoft.com/office/word/2010/wordprocessingGroup" xmlns:wps="http://schemas.microsoft.com/office/word/2010/wordprocessingShape" mc:Ignorable="w14 w15 w16se w16cid w16 w16cex w16sdtdh wp14">
+<w:document xmlns:wpc="http://schemas.microsoft.com/office/word/2010/wordprocessingCanvas" xmlns:mo="http://schemas.microsoft.com/office/mac/office/2008/main" xmlns:mc="http://schemas.openxmlformats.org/markup-compatibility/2006" xmlns:mv="urn:schemas-microsoft-com:mac:vml" xmlns:o="urn:schemas-microsoft-com:office:office" xmlns:r="http://schemas.openxmlformats.org/officeDocument/2006/relationships" xmlns:m="http://schemas.openxmlformats.org/officeDocument/2006/math" xmlns:v="urn:schemas-microsoft-com:vml" xmlns:wp14="http://schemas.microsoft.com/office/word/2010/wordprocessingDrawing" xmlns:wp="http://schemas.openxmlformats.org/drawingml/2006/wordprocessingDrawing" xmlns:w10="urn:schemas-microsoft-com:office:word" xmlns:w="http://schemas.openxmlformats.org/wordprocessingml/2006/main" xmlns:w14="http://schemas.microsoft.com/office/word/2010/wordml" xmlns:wpg="http://schemas.microsoft.com/office/word/2010/wordprocessingGroup" xmlns:wpi="http://schemas.microsoft.com/office/word/2010/wordprocessingInk" xmlns:wne="http://schemas.microsoft.com/office/word/2006/wordml" xmlns:wps="http://schemas.microsoft.com/office/word/2010/wordprocessingShape" mc:Ignorable="w14 wp14">
   <w:body>
     <w:p>
       <w:pPr>
-        <w:pStyle w:val="Title"/>
+        <w:spacing w:before="0" w:after="240"/>
         <w:jc w:val="center"/>
       </w:pPr>
+      <w:r>
+        <w:rPr>
+          <w:rFonts w:ascii="Calibri" w:hAnsi="Calibri"/>
+          <w:b/>
+          <w:color w:val="1F497D"/>
+          <w:sz w:val="32"/>
+        </w:rPr>
+        <w:t>ĐỀ XUẤT PHƯƠNG PHÁP &amp; KẾ HOẠCH NGHIÊN CỨU FEDERATED LEARNING</w:t>
+      </w:r>
     </w:p>
     <w:p>
       <w:pPr>
-        <w:spacing w:after="200" w:line="276" w:lineRule="auto"/>
+        <w:spacing w:after="320"/>
+        <w:jc w:val="center"/>
       </w:pPr>
+      <w:r>
+        <w:rPr>
+          <w:rFonts w:ascii="Calibri" w:hAnsi="Calibri"/>
+          <w:i/>
+          <w:color w:val="595959"/>
+          <w:sz w:val="24"/>
+        </w:rPr>
+        <w:t>Báo Cáo Tái Hiện Baseline FedSLD (ISBI 2022) &amp; Luận Giải Kỹ Thuật Trước Hội Đồng</w:t>
+      </w:r>
     </w:p>
     <w:p>
       <w:pPr>
@@ -19,187 +38,90 @@
       </w:pPr>
       <w:r>
         <w:rPr>
-          <w:rFonts w:ascii="Times New Roman" w:hAnsi="Times New Roman" w:eastAsia="ＭＳ ゴシック" w:cs="Times New Roman" w:eastAsiaTheme="majorEastAsia" w:csTheme="majorBidi"/>
-          <w:b/>
-          <w:bCs/>
-          <w:color w:val="1F457A"/>
-          <w:sz w:val="26"/>
-          <w:szCs w:val="28"/>
+          <w:color w:val="1F497D"/>
         </w:rPr>
         <w:t>1. Paper tham khảo làm Baseline</w:t>
       </w:r>
     </w:p>
     <w:p>
-      <w:pPr>
-        <w:spacing w:after="80"/>
-      </w:pPr>
       <w:r>
-        <w:rPr>
-          <w:rFonts w:ascii="Times New Roman" w:hAnsi="Times New Roman" w:eastAsia="ＭＳ 明朝" w:cs="Times New Roman" w:eastAsiaTheme="minorEastAsia" w:csTheme="minorBidi"/>
-          <w:sz w:val="24"/>
-          <w:szCs w:val="22"/>
-        </w:rPr>
-        <w:t>Nhóm em đề xuất sử dụng paper "FedSLD: Federated Learning with Shared Label Distribution" (Luo &amp; Wu) làm tài liệu tham khảo cơ sở cho thiết kế thí nghiệm. Paper này được đăng tải tại hội nghị quốc tế uy tín (</w:t>
+        <w:t xml:space="preserve">Nhóm đề xuất sử dụng bài báo </w:t>
       </w:r>
       <w:r>
         <w:rPr>
           <w:b/>
-          <w:bCs/>
-          <w:i/>
-          <w:iCs/>
         </w:rPr>
-        <w:t>IEEE ISBI 2022 (IEEE International Symposium on Biomedical Imagin</w:t>
+        <w:t>"FedSLD: Federated Learning with Shared Label Distribution" (Luo &amp; Wu)</w:t>
+      </w:r>
+      <w:r>
+        <w:t xml:space="preserve"> làm tài liệu tham khảo cơ sở cho thiết kế thí nghiệm. Bài báo được công bố tại hội nghị quốc tế uy tín </w:t>
       </w:r>
       <w:r>
         <w:rPr>
-          <w:rFonts w:ascii="Times New Roman" w:hAnsi="Times New Roman" w:eastAsia="ＭＳ 明朝" w:cs="Times New Roman" w:eastAsiaTheme="minorEastAsia" w:csTheme="minorBidi"/>
-          <w:sz w:val="24"/>
-          <w:szCs w:val="22"/>
+          <w:b/>
         </w:rPr>
-        <w:t xml:space="preserve">) </w:t>
+        <w:t>IEEE ISBI 2022 (IEEE International Symposium on Biomedical Imaging, Core Rank A)</w:t>
       </w:r>
       <w:r>
-        <w:rPr>
-          <w:rFonts w:ascii="Times New Roman" w:hAnsi="Times New Roman" w:eastAsia="ＭＳ 明朝" w:cs="Times New Roman" w:eastAsiaTheme="minorEastAsia" w:csTheme="minorBidi"/>
-          <w:b/>
-          <w:bCs/>
-          <w:sz w:val="24"/>
-          <w:szCs w:val="22"/>
-        </w:rPr>
-        <w:t>Core Rank</w:t>
-      </w:r>
-      <w:r>
-        <w:rPr>
-          <w:rFonts w:ascii="Times New Roman" w:hAnsi="Times New Roman" w:eastAsia="ＭＳ 明朝" w:cs="Times New Roman" w:eastAsiaTheme="minorEastAsia" w:csTheme="minorBidi"/>
-          <w:sz w:val="24"/>
-          <w:szCs w:val="22"/>
-        </w:rPr>
-        <w:t xml:space="preserve"> </w:t>
-      </w:r>
-      <w:r>
-        <w:rPr>
-          <w:rFonts w:ascii="Times New Roman" w:hAnsi="Times New Roman" w:eastAsia="ＭＳ 明朝" w:cs="Times New Roman" w:eastAsiaTheme="minorEastAsia" w:csTheme="minorBidi"/>
-          <w:b/>
-          <w:bCs/>
-          <w:sz w:val="24"/>
-          <w:szCs w:val="22"/>
-        </w:rPr>
-        <w:t>A</w:t>
-      </w:r>
-      <w:r>
-        <w:rPr>
-          <w:rFonts w:ascii="Times New Roman" w:hAnsi="Times New Roman" w:eastAsia="ＭＳ 明朝" w:cs="Times New Roman" w:eastAsiaTheme="minorEastAsia" w:csTheme="minorBidi"/>
-          <w:sz w:val="24"/>
-          <w:szCs w:val="22"/>
-        </w:rPr>
-        <w:t>), cung cấp kết quả FedAvg và FedProx trên các bộ dữ liệu y tế làm cơ sở so sánh đáng tin cậy.</w:t>
+        <w:t>, cung cấp kết quả thực nghiệm FedAvg và FedProx trên các tập dữ liệu y tế chuẩn làm cơ sở so sánh tin cậy.</w:t>
       </w:r>
     </w:p>
     <w:p>
-      <w:pPr>
-        <w:spacing w:after="80"/>
-      </w:pPr>
       <w:r>
-        <w:rPr>
-          <w:rFonts w:ascii="Times New Roman" w:hAnsi="Times New Roman" w:eastAsia="ＭＳ 明朝" w:cs="Times New Roman" w:eastAsiaTheme="minorEastAsia" w:csTheme="minorBidi"/>
-          <w:sz w:val="24"/>
-          <w:szCs w:val="22"/>
-        </w:rPr>
-        <w:t>Paper sử dụng hai bộ dữ liệu y tế từ bộ MedMNIST:</w:t>
+        <w:t>Bài báo sử dụng hai bộ dữ liệu y tế từ benchmark MedMNIST Decathlon:</w:t>
       </w:r>
     </w:p>
     <w:p>
       <w:pPr>
         <w:pStyle w:val="ListBullet"/>
-        <w:spacing w:after="40"/>
-        <w:ind w:left="360" w:hanging="360"/>
       </w:pPr>
       <w:r>
         <w:rPr>
-          <w:rFonts w:ascii="Times New Roman" w:hAnsi="Times New Roman" w:eastAsia="ＭＳ 明朝" w:cs="Times New Roman" w:eastAsiaTheme="minorEastAsia" w:csTheme="minorBidi"/>
-          <w:sz w:val="24"/>
-          <w:szCs w:val="22"/>
+          <w:b/>
         </w:rPr>
-        <w:t>PathMNIST — 9 lớp, hình ảnh mô học ung thư đại trực tràng, 28×28 RGB</w:t>
+        <w:t>PathMNIST</w:t>
+      </w:r>
+      <w:r>
+        <w:t xml:space="preserve"> — 9 lớp, hình ảnh mô học ung thư đại trực tràng, kích thước 28×28, ảnh màu 3-channel RGB (89,996 ảnh train, 7,180 ảnh test).</w:t>
       </w:r>
     </w:p>
     <w:p>
       <w:pPr>
         <w:pStyle w:val="ListBullet"/>
-        <w:spacing w:after="40"/>
-        <w:ind w:left="360" w:hanging="360"/>
       </w:pPr>
       <w:r>
         <w:rPr>
-          <w:rFonts w:ascii="Times New Roman" w:hAnsi="Times New Roman" w:eastAsia="ＭＳ 明朝" w:cs="Times New Roman" w:eastAsiaTheme="minorEastAsia" w:csTheme="minorBidi"/>
-          <w:sz w:val="24"/>
-          <w:szCs w:val="22"/>
+          <w:b/>
         </w:rPr>
-        <w:t>OrganMNIST (Axial) — 11 lớp, hình ảnh CT bụng, 28×28 grayscale</w:t>
+        <w:t>OrganMNIST (Axial)</w:t>
+      </w:r>
+      <w:r>
+        <w:t xml:space="preserve"> — 11 lớp, hình ảnh chụp cắt lớp vi tính CT ổ bụng, kích thước 28×28, ảnh xám 1-channel Grayscale (34,581 ảnh train, 17,778 ảnh test).</w:t>
       </w:r>
     </w:p>
     <w:p>
-      <w:pPr>
-        <w:spacing w:after="200" w:line="276" w:lineRule="auto"/>
-      </w:pPr>
-    </w:p>
-    <w:p>
-      <w:pPr>
-        <w:spacing w:after="80"/>
-      </w:pPr>
       <w:r>
-        <w:rPr>
-          <w:rFonts w:ascii="Times New Roman" w:hAnsi="Times New Roman" w:eastAsia="ＭＳ 明朝" w:cs="Times New Roman" w:eastAsiaTheme="minorEastAsia" w:csTheme="minorBidi"/>
-          <w:sz w:val="24"/>
-          <w:szCs w:val="22"/>
-        </w:rPr>
-        <w:t>Kết quả FedAvg và FedProx được paper công bố (Practical Non-IID, 12 clients):</w:t>
+        <w:t>Kết quả FedAvg, FedProx và FedSLD được bài báo công bố trong kịch bản Practical Non-IID (12 clients, 80 rounds):</w:t>
       </w:r>
     </w:p>
     <w:tbl>
       <w:tblPr>
         <w:tblStyle w:val="TableGrid"/>
-        <w:tblW w:w="0" w:type="auto"/>
+        <w:tblW w:type="auto" w:w="0"/>
         <w:jc w:val="center"/>
-        <w:tblBorders>
-          <w:top w:val="single" w:sz="4" w:space="0" w:color="auto"/>
-          <w:left w:val="single" w:sz="4" w:space="0" w:color="auto"/>
-          <w:bottom w:val="single" w:sz="4" w:space="0" w:color="auto"/>
-          <w:right w:val="single" w:sz="4" w:space="0" w:color="auto"/>
-          <w:insideH w:val="single" w:sz="4" w:space="0" w:color="auto"/>
-          <w:insideV w:val="single" w:sz="4" w:space="0" w:color="auto"/>
-        </w:tblBorders>
-        <w:tblCellMar>
-          <w:top w:w="0" w:type="dxa"/>
-          <w:left w:w="108" w:type="dxa"/>
-          <w:bottom w:w="0" w:type="dxa"/>
-          <w:right w:w="108" w:type="dxa"/>
-        </w:tblCellMar>
-        <w:tblLook w:firstRow="1" w:firstColumn="1" w:noVBand="1"/>
+        <w:tblLook w:firstColumn="1" w:firstRow="1" w:lastColumn="0" w:lastRow="0" w:noHBand="0" w:noVBand="1" w:val="04A0"/>
       </w:tblPr>
       <w:tblGrid>
-        <w:gridCol w:w="2351"/>
-        <w:gridCol w:w="2351"/>
-        <w:gridCol w:w="2351"/>
-        <w:gridCol w:w="2351"/>
+        <w:gridCol w:w="2412"/>
+        <w:gridCol w:w="2412"/>
+        <w:gridCol w:w="2412"/>
+        <w:gridCol w:w="2412"/>
       </w:tblGrid>
       <w:tr>
         <w:tc>
           <w:tcPr>
-            <w:tcW w:w="3402" w:type="dxa"/>
-            <w:tcBorders>
-              <w:top w:val="single" w:sz="4" w:space="0" w:color="auto"/>
-              <w:left w:val="single" w:sz="4" w:space="0" w:color="auto"/>
-              <w:bottom w:val="single" w:sz="4" w:space="0" w:color="auto"/>
-              <w:right w:val="single" w:sz="4" w:space="0" w:color="auto"/>
-            </w:tcBorders>
-            <w:shd w:val="clear" w:fill="BDD7EE"/>
-            <w:tcMar>
-              <w:top w:w="0" w:type="dxa"/>
-              <w:left w:w="108" w:type="dxa"/>
-              <w:bottom w:w="0" w:type="dxa"/>
-              <w:right w:w="108" w:type="dxa"/>
-            </w:tcMar>
+            <w:tcW w:type="dxa" w:w="2412"/>
+            <w:shd w:fill="1F497D"/>
           </w:tcPr>
           <w:p>
             <w:pPr>
@@ -207,11 +129,10 @@
             </w:pPr>
             <w:r>
               <w:rPr>
-                <w:rFonts w:ascii="Times New Roman" w:hAnsi="Times New Roman" w:eastAsia="ＭＳ 明朝" w:cs="Times New Roman" w:eastAsiaTheme="minorEastAsia" w:csTheme="minorBidi"/>
+                <w:rFonts w:ascii="Calibri" w:hAnsi="Calibri"/>
                 <w:b/>
-                <w:bCs/>
-                <w:sz w:val="22"/>
-                <w:szCs w:val="22"/>
+                <w:color w:val="FFFFFF"/>
+                <w:sz w:val="20"/>
               </w:rPr>
               <w:t>Dataset</w:t>
             </w:r>
@@ -219,20 +140,8 @@
         </w:tc>
         <w:tc>
           <w:tcPr>
-            <w:tcW w:w="1984" w:type="dxa"/>
-            <w:tcBorders>
-              <w:top w:val="single" w:sz="4" w:space="0" w:color="auto"/>
-              <w:left w:val="single" w:sz="4" w:space="0" w:color="auto"/>
-              <w:bottom w:val="single" w:sz="4" w:space="0" w:color="auto"/>
-              <w:right w:val="single" w:sz="4" w:space="0" w:color="auto"/>
-            </w:tcBorders>
-            <w:shd w:val="clear" w:fill="BDD7EE"/>
-            <w:tcMar>
-              <w:top w:w="0" w:type="dxa"/>
-              <w:left w:w="108" w:type="dxa"/>
-              <w:bottom w:w="0" w:type="dxa"/>
-              <w:right w:w="108" w:type="dxa"/>
-            </w:tcMar>
+            <w:tcW w:type="dxa" w:w="2412"/>
+            <w:shd w:fill="1F497D"/>
           </w:tcPr>
           <w:p>
             <w:pPr>
@@ -240,11 +149,10 @@
             </w:pPr>
             <w:r>
               <w:rPr>
-                <w:rFonts w:ascii="Times New Roman" w:hAnsi="Times New Roman" w:eastAsia="ＭＳ 明朝" w:cs="Times New Roman" w:eastAsiaTheme="minorEastAsia" w:csTheme="minorBidi"/>
+                <w:rFonts w:ascii="Calibri" w:hAnsi="Calibri"/>
                 <w:b/>
-                <w:bCs/>
-                <w:sz w:val="22"/>
-                <w:szCs w:val="22"/>
+                <w:color w:val="FFFFFF"/>
+                <w:sz w:val="20"/>
               </w:rPr>
               <w:t>FedAvg (BTA)</w:t>
             </w:r>
@@ -252,20 +160,8 @@
         </w:tc>
         <w:tc>
           <w:tcPr>
-            <w:tcW w:w="1984" w:type="dxa"/>
-            <w:tcBorders>
-              <w:top w:val="single" w:sz="4" w:space="0" w:color="auto"/>
-              <w:left w:val="single" w:sz="4" w:space="0" w:color="auto"/>
-              <w:bottom w:val="single" w:sz="4" w:space="0" w:color="auto"/>
-              <w:right w:val="single" w:sz="4" w:space="0" w:color="auto"/>
-            </w:tcBorders>
-            <w:shd w:val="clear" w:fill="BDD7EE"/>
-            <w:tcMar>
-              <w:top w:w="0" w:type="dxa"/>
-              <w:left w:w="108" w:type="dxa"/>
-              <w:bottom w:w="0" w:type="dxa"/>
-              <w:right w:w="108" w:type="dxa"/>
-            </w:tcMar>
+            <w:tcW w:type="dxa" w:w="2412"/>
+            <w:shd w:fill="1F497D"/>
           </w:tcPr>
           <w:p>
             <w:pPr>
@@ -273,11 +169,10 @@
             </w:pPr>
             <w:r>
               <w:rPr>
-                <w:rFonts w:ascii="Times New Roman" w:hAnsi="Times New Roman" w:eastAsia="ＭＳ 明朝" w:cs="Times New Roman" w:eastAsiaTheme="minorEastAsia" w:csTheme="minorBidi"/>
+                <w:rFonts w:ascii="Calibri" w:hAnsi="Calibri"/>
                 <w:b/>
-                <w:bCs/>
-                <w:sz w:val="22"/>
-                <w:szCs w:val="22"/>
+                <w:color w:val="FFFFFF"/>
+                <w:sz w:val="20"/>
               </w:rPr>
               <w:t>FedProx (BTA)</w:t>
             </w:r>
@@ -285,20 +180,8 @@
         </w:tc>
         <w:tc>
           <w:tcPr>
-            <w:tcW w:w="1984" w:type="dxa"/>
-            <w:tcBorders>
-              <w:top w:val="single" w:sz="4" w:space="0" w:color="auto"/>
-              <w:left w:val="single" w:sz="4" w:space="0" w:color="auto"/>
-              <w:bottom w:val="single" w:sz="4" w:space="0" w:color="auto"/>
-              <w:right w:val="single" w:sz="4" w:space="0" w:color="auto"/>
-            </w:tcBorders>
-            <w:shd w:val="clear" w:fill="BDD7EE"/>
-            <w:tcMar>
-              <w:top w:w="0" w:type="dxa"/>
-              <w:left w:w="108" w:type="dxa"/>
-              <w:bottom w:w="0" w:type="dxa"/>
-              <w:right w:w="108" w:type="dxa"/>
-            </w:tcMar>
+            <w:tcW w:type="dxa" w:w="2412"/>
+            <w:shd w:fill="1F497D"/>
           </w:tcPr>
           <w:p>
             <w:pPr>
@@ -306,13 +189,12 @@
             </w:pPr>
             <w:r>
               <w:rPr>
-                <w:rFonts w:ascii="Times New Roman" w:hAnsi="Times New Roman" w:eastAsia="ＭＳ 明朝" w:cs="Times New Roman" w:eastAsiaTheme="minorEastAsia" w:csTheme="minorBidi"/>
+                <w:rFonts w:ascii="Calibri" w:hAnsi="Calibri"/>
                 <w:b/>
-                <w:bCs/>
-                <w:sz w:val="22"/>
-                <w:szCs w:val="22"/>
+                <w:color w:val="FFFFFF"/>
+                <w:sz w:val="20"/>
               </w:rPr>
-              <w:t>FedSLD (BTA)</w:t>
+              <w:t>FedSLD (BTA - Đề xuất của tác giả)</w:t>
             </w:r>
           </w:p>
         </w:tc>
@@ -320,19 +202,24 @@
       <w:tr>
         <w:tc>
           <w:tcPr>
-            <w:tcW w:w="3402" w:type="dxa"/>
-            <w:tcBorders>
-              <w:top w:val="single" w:sz="4" w:space="0" w:color="auto"/>
-              <w:left w:val="single" w:sz="4" w:space="0" w:color="auto"/>
-              <w:bottom w:val="single" w:sz="4" w:space="0" w:color="auto"/>
-              <w:right w:val="single" w:sz="4" w:space="0" w:color="auto"/>
-            </w:tcBorders>
-            <w:tcMar>
-              <w:top w:w="0" w:type="dxa"/>
-              <w:left w:w="108" w:type="dxa"/>
-              <w:bottom w:w="0" w:type="dxa"/>
-              <w:right w:w="108" w:type="dxa"/>
-            </w:tcMar>
+            <w:tcW w:type="dxa" w:w="2412"/>
+            <w:shd w:fill="FFFFFF"/>
+          </w:tcPr>
+          <w:p>
+            <w:r>
+              <w:rPr>
+                <w:rFonts w:ascii="Calibri" w:hAnsi="Calibri"/>
+                <w:b/>
+                <w:sz w:val="20"/>
+              </w:rPr>
+              <w:t>PathMNIST (9 classes, RGB)</w:t>
+            </w:r>
+          </w:p>
+        </w:tc>
+        <w:tc>
+          <w:tcPr>
+            <w:tcW w:type="dxa" w:w="2412"/>
+            <w:shd w:fill="FFFFFF"/>
           </w:tcPr>
           <w:p>
             <w:pPr>
@@ -340,29 +227,17 @@
             </w:pPr>
             <w:r>
               <w:rPr>
-                <w:rFonts w:ascii="Times New Roman" w:hAnsi="Times New Roman" w:eastAsia="ＭＳ 明朝" w:cs="Times New Roman" w:eastAsiaTheme="minorEastAsia" w:csTheme="minorBidi"/>
-                <w:sz w:val="22"/>
-                <w:szCs w:val="22"/>
+                <w:rFonts w:ascii="Calibri" w:hAnsi="Calibri"/>
+                <w:sz w:val="20"/>
               </w:rPr>
-              <w:t>PathMNIST</w:t>
+              <w:t>57.38%</w:t>
             </w:r>
           </w:p>
         </w:tc>
         <w:tc>
           <w:tcPr>
-            <w:tcW w:w="1984" w:type="dxa"/>
-            <w:tcBorders>
-              <w:top w:val="single" w:sz="4" w:space="0" w:color="auto"/>
-              <w:left w:val="single" w:sz="4" w:space="0" w:color="auto"/>
-              <w:bottom w:val="single" w:sz="4" w:space="0" w:color="auto"/>
-              <w:right w:val="single" w:sz="4" w:space="0" w:color="auto"/>
-            </w:tcBorders>
-            <w:tcMar>
-              <w:top w:w="0" w:type="dxa"/>
-              <w:left w:w="108" w:type="dxa"/>
-              <w:bottom w:w="0" w:type="dxa"/>
-              <w:right w:w="108" w:type="dxa"/>
-            </w:tcMar>
+            <w:tcW w:type="dxa" w:w="2412"/>
+            <w:shd w:fill="FFFFFF"/>
           </w:tcPr>
           <w:p>
             <w:pPr>
@@ -370,29 +245,17 @@
             </w:pPr>
             <w:r>
               <w:rPr>
-                <w:rFonts w:ascii="Times New Roman" w:hAnsi="Times New Roman" w:eastAsia="ＭＳ 明朝" w:cs="Times New Roman" w:eastAsiaTheme="minorEastAsia" w:csTheme="minorBidi"/>
-                <w:sz w:val="22"/>
-                <w:szCs w:val="22"/>
+                <w:rFonts w:ascii="Calibri" w:hAnsi="Calibri"/>
+                <w:sz w:val="20"/>
               </w:rPr>
-              <w:t>57.38%</w:t>
+              <w:t>57.72%</w:t>
             </w:r>
           </w:p>
         </w:tc>
         <w:tc>
           <w:tcPr>
-            <w:tcW w:w="1984" w:type="dxa"/>
-            <w:tcBorders>
-              <w:top w:val="single" w:sz="4" w:space="0" w:color="auto"/>
-              <w:left w:val="single" w:sz="4" w:space="0" w:color="auto"/>
-              <w:bottom w:val="single" w:sz="4" w:space="0" w:color="auto"/>
-              <w:right w:val="single" w:sz="4" w:space="0" w:color="auto"/>
-            </w:tcBorders>
-            <w:tcMar>
-              <w:top w:w="0" w:type="dxa"/>
-              <w:left w:w="108" w:type="dxa"/>
-              <w:bottom w:w="0" w:type="dxa"/>
-              <w:right w:w="108" w:type="dxa"/>
-            </w:tcMar>
+            <w:tcW w:type="dxa" w:w="2412"/>
+            <w:shd w:fill="FFFFFF"/>
           </w:tcPr>
           <w:p>
             <w:pPr>
@@ -400,39 +263,8 @@
             </w:pPr>
             <w:r>
               <w:rPr>
-                <w:rFonts w:ascii="Times New Roman" w:hAnsi="Times New Roman" w:eastAsia="ＭＳ 明朝" w:cs="Times New Roman" w:eastAsiaTheme="minorEastAsia" w:csTheme="minorBidi"/>
-                <w:sz w:val="22"/>
-                <w:szCs w:val="22"/>
-              </w:rPr>
-              <w:t>57.72%</w:t>
-            </w:r>
-          </w:p>
-        </w:tc>
-        <w:tc>
-          <w:tcPr>
-            <w:tcW w:w="1984" w:type="dxa"/>
-            <w:tcBorders>
-              <w:top w:val="single" w:sz="4" w:space="0" w:color="auto"/>
-              <w:left w:val="single" w:sz="4" w:space="0" w:color="auto"/>
-              <w:bottom w:val="single" w:sz="4" w:space="0" w:color="auto"/>
-              <w:right w:val="single" w:sz="4" w:space="0" w:color="auto"/>
-            </w:tcBorders>
-            <w:tcMar>
-              <w:top w:w="0" w:type="dxa"/>
-              <w:left w:w="108" w:type="dxa"/>
-              <w:bottom w:w="0" w:type="dxa"/>
-              <w:right w:w="108" w:type="dxa"/>
-            </w:tcMar>
-          </w:tcPr>
-          <w:p>
-            <w:pPr>
-              <w:jc w:val="center"/>
-            </w:pPr>
-            <w:r>
-              <w:rPr>
-                <w:rFonts w:ascii="Times New Roman" w:hAnsi="Times New Roman" w:eastAsia="ＭＳ 明朝" w:cs="Times New Roman" w:eastAsiaTheme="minorEastAsia" w:csTheme="minorBidi"/>
-                <w:sz w:val="22"/>
-                <w:szCs w:val="22"/>
+                <w:rFonts w:ascii="Calibri" w:hAnsi="Calibri"/>
+                <w:sz w:val="20"/>
               </w:rPr>
               <w:t>57.90%</w:t>
             </w:r>
@@ -442,19 +274,24 @@
       <w:tr>
         <w:tc>
           <w:tcPr>
-            <w:tcW w:w="3402" w:type="dxa"/>
-            <w:tcBorders>
-              <w:top w:val="single" w:sz="4" w:space="0" w:color="auto"/>
-              <w:left w:val="single" w:sz="4" w:space="0" w:color="auto"/>
-              <w:bottom w:val="single" w:sz="4" w:space="0" w:color="auto"/>
-              <w:right w:val="single" w:sz="4" w:space="0" w:color="auto"/>
-            </w:tcBorders>
-            <w:tcMar>
-              <w:top w:w="0" w:type="dxa"/>
-              <w:left w:w="108" w:type="dxa"/>
-              <w:bottom w:w="0" w:type="dxa"/>
-              <w:right w:w="108" w:type="dxa"/>
-            </w:tcMar>
+            <w:tcW w:type="dxa" w:w="2412"/>
+            <w:shd w:fill="F2F5F9"/>
+          </w:tcPr>
+          <w:p>
+            <w:r>
+              <w:rPr>
+                <w:rFonts w:ascii="Calibri" w:hAnsi="Calibri"/>
+                <w:b/>
+                <w:sz w:val="20"/>
+              </w:rPr>
+              <w:t>OrganMNIST-Axial (11 classes, Gray)</w:t>
+            </w:r>
+          </w:p>
+        </w:tc>
+        <w:tc>
+          <w:tcPr>
+            <w:tcW w:type="dxa" w:w="2412"/>
+            <w:shd w:fill="F2F5F9"/>
           </w:tcPr>
           <w:p>
             <w:pPr>
@@ -462,9 +299,235 @@
             </w:pPr>
             <w:r>
               <w:rPr>
-                <w:rFonts w:ascii="Times New Roman" w:hAnsi="Times New Roman" w:eastAsia="ＭＳ 明朝" w:cs="Times New Roman" w:eastAsiaTheme="minorEastAsia" w:csTheme="minorBidi"/>
-                <w:sz w:val="22"/>
-                <w:szCs w:val="22"/>
+                <w:rFonts w:ascii="Calibri" w:hAnsi="Calibri"/>
+                <w:sz w:val="20"/>
+              </w:rPr>
+              <w:t>85.69%</w:t>
+            </w:r>
+          </w:p>
+        </w:tc>
+        <w:tc>
+          <w:tcPr>
+            <w:tcW w:type="dxa" w:w="2412"/>
+            <w:shd w:fill="F2F5F9"/>
+          </w:tcPr>
+          <w:p>
+            <w:pPr>
+              <w:jc w:val="center"/>
+            </w:pPr>
+            <w:r>
+              <w:rPr>
+                <w:rFonts w:ascii="Calibri" w:hAnsi="Calibri"/>
+                <w:sz w:val="20"/>
+              </w:rPr>
+              <w:t>85.54%</w:t>
+            </w:r>
+          </w:p>
+        </w:tc>
+        <w:tc>
+          <w:tcPr>
+            <w:tcW w:type="dxa" w:w="2412"/>
+            <w:shd w:fill="F2F5F9"/>
+          </w:tcPr>
+          <w:p>
+            <w:pPr>
+              <w:jc w:val="center"/>
+            </w:pPr>
+            <w:r>
+              <w:rPr>
+                <w:rFonts w:ascii="Calibri" w:hAnsi="Calibri"/>
+                <w:sz w:val="20"/>
+              </w:rPr>
+              <w:t>87.37%</w:t>
+            </w:r>
+          </w:p>
+        </w:tc>
+      </w:tr>
+    </w:tbl>
+    <w:p/>
+    <w:p>
+      <w:pPr>
+        <w:pStyle w:val="Heading1"/>
+      </w:pPr>
+      <w:r>
+        <w:rPr>
+          <w:color w:val="1F497D"/>
+        </w:rPr>
+        <w:t>2. Kết Quả Thực Nghiệm Tái Hiện (Reproduction) &amp; Giải Trình Chuyên Sâu Cho Hội Đồng</w:t>
+      </w:r>
+    </w:p>
+    <w:p>
+      <w:r>
+        <w:t xml:space="preserve">Để bảo đảm tính khách quan và khoa học trước khi tiến hành thử nghiệm các thuật toán mới, nhóm đã triển khai quy trình tái hiện độc lập mô hình </w:t>
+      </w:r>
+      <w:r>
+        <w:rPr>
+          <w:b/>
+        </w:rPr>
+        <w:t>CNN 4 lớp (~570K tham số)</w:t>
+      </w:r>
+      <w:r>
+        <w:t xml:space="preserve"> nguyên bản theo đúng mô tả của bài báo FedSLD trên nền tảng FL chuẩn hóa hiện đại </w:t>
+      </w:r>
+      <w:r>
+        <w:rPr>
+          <w:b/>
+        </w:rPr>
+        <w:t>Flower (flwr 1.25) + PyTorch 2.6</w:t>
+      </w:r>
+      <w:r>
+        <w:t>. Kết quả đối chứng thực tế như sau:</w:t>
+      </w:r>
+    </w:p>
+    <w:tbl>
+      <w:tblPr>
+        <w:tblStyle w:val="TableGrid"/>
+        <w:tblW w:type="auto" w:w="0"/>
+        <w:jc w:val="center"/>
+        <w:tblLook w:firstColumn="1" w:firstRow="1" w:lastColumn="0" w:lastRow="0" w:noHBand="0" w:noVBand="1" w:val="04A0"/>
+      </w:tblPr>
+      <w:tblGrid>
+        <w:gridCol w:w="1608"/>
+        <w:gridCol w:w="1608"/>
+        <w:gridCol w:w="1608"/>
+        <w:gridCol w:w="1608"/>
+        <w:gridCol w:w="1608"/>
+        <w:gridCol w:w="1608"/>
+      </w:tblGrid>
+      <w:tr>
+        <w:tc>
+          <w:tcPr>
+            <w:tcW w:type="dxa" w:w="1608"/>
+            <w:shd w:fill="2E5B88"/>
+          </w:tcPr>
+          <w:p>
+            <w:pPr>
+              <w:jc w:val="center"/>
+            </w:pPr>
+            <w:r>
+              <w:rPr>
+                <w:rFonts w:ascii="Calibri" w:hAnsi="Calibri"/>
+                <w:b/>
+                <w:color w:val="FFFFFF"/>
+                <w:sz w:val="19"/>
+              </w:rPr>
+              <w:t>Dataset</w:t>
+            </w:r>
+          </w:p>
+        </w:tc>
+        <w:tc>
+          <w:tcPr>
+            <w:tcW w:type="dxa" w:w="1608"/>
+            <w:shd w:fill="2E5B88"/>
+          </w:tcPr>
+          <w:p>
+            <w:pPr>
+              <w:jc w:val="center"/>
+            </w:pPr>
+            <w:r>
+              <w:rPr>
+                <w:rFonts w:ascii="Calibri" w:hAnsi="Calibri"/>
+                <w:b/>
+                <w:color w:val="FFFFFF"/>
+                <w:sz w:val="19"/>
+              </w:rPr>
+              <w:t>Kênh màu &amp; Dữ liệu</w:t>
+            </w:r>
+          </w:p>
+        </w:tc>
+        <w:tc>
+          <w:tcPr>
+            <w:tcW w:type="dxa" w:w="1608"/>
+            <w:shd w:fill="2E5B88"/>
+          </w:tcPr>
+          <w:p>
+            <w:pPr>
+              <w:jc w:val="center"/>
+            </w:pPr>
+            <w:r>
+              <w:rPr>
+                <w:rFonts w:ascii="Calibri" w:hAnsi="Calibri"/>
+                <w:b/>
+                <w:color w:val="FFFFFF"/>
+                <w:sz w:val="19"/>
+              </w:rPr>
+              <w:t>Paper ISBI 2022 (FedAvg BTA)</w:t>
+            </w:r>
+          </w:p>
+        </w:tc>
+        <w:tc>
+          <w:tcPr>
+            <w:tcW w:type="dxa" w:w="1608"/>
+            <w:shd w:fill="2E5B88"/>
+          </w:tcPr>
+          <w:p>
+            <w:pPr>
+              <w:jc w:val="center"/>
+            </w:pPr>
+            <w:r>
+              <w:rPr>
+                <w:rFonts w:ascii="Calibri" w:hAnsi="Calibri"/>
+                <w:b/>
+                <w:color w:val="FFFFFF"/>
+                <w:sz w:val="19"/>
+              </w:rPr>
+              <w:t>Tái hiện của nhóm (FedAvg BTA - 570K)</w:t>
+            </w:r>
+          </w:p>
+        </w:tc>
+        <w:tc>
+          <w:tcPr>
+            <w:tcW w:type="dxa" w:w="1608"/>
+            <w:shd w:fill="2E5B88"/>
+          </w:tcPr>
+          <w:p>
+            <w:pPr>
+              <w:jc w:val="center"/>
+            </w:pPr>
+            <w:r>
+              <w:rPr>
+                <w:rFonts w:ascii="Calibri" w:hAnsi="Calibri"/>
+                <w:b/>
+                <w:color w:val="FFFFFF"/>
+                <w:sz w:val="19"/>
+              </w:rPr>
+              <w:t>Chênh lệch (Delta)</w:t>
+            </w:r>
+          </w:p>
+        </w:tc>
+        <w:tc>
+          <w:tcPr>
+            <w:tcW w:type="dxa" w:w="1608"/>
+            <w:shd w:fill="2E5B88"/>
+          </w:tcPr>
+          <w:p>
+            <w:pPr>
+              <w:jc w:val="center"/>
+            </w:pPr>
+            <w:r>
+              <w:rPr>
+                <w:rFonts w:ascii="Calibri" w:hAnsi="Calibri"/>
+                <w:b/>
+                <w:color w:val="FFFFFF"/>
+                <w:sz w:val="19"/>
+              </w:rPr>
+              <w:t>Đánh giá tính chuẩn xác</w:t>
+            </w:r>
+          </w:p>
+        </w:tc>
+      </w:tr>
+      <w:tr>
+        <w:tc>
+          <w:tcPr>
+            <w:tcW w:type="dxa" w:w="1608"/>
+            <w:shd w:fill="FFFFFF"/>
+          </w:tcPr>
+          <w:p>
+            <w:r>
+              <w:rPr>
+                <w:rFonts w:ascii="Calibri" w:hAnsi="Calibri"/>
+                <w:b/>
+                <w:sz w:val="19"/>
               </w:rPr>
               <w:t>OrganMNIST (Axial)</w:t>
             </w:r>
@@ -472,19 +535,23 @@
         </w:tc>
         <w:tc>
           <w:tcPr>
-            <w:tcW w:w="1984" w:type="dxa"/>
-            <w:tcBorders>
-              <w:top w:val="single" w:sz="4" w:space="0" w:color="auto"/>
-              <w:left w:val="single" w:sz="4" w:space="0" w:color="auto"/>
-              <w:bottom w:val="single" w:sz="4" w:space="0" w:color="auto"/>
-              <w:right w:val="single" w:sz="4" w:space="0" w:color="auto"/>
-            </w:tcBorders>
-            <w:tcMar>
-              <w:top w:w="0" w:type="dxa"/>
-              <w:left w:w="108" w:type="dxa"/>
-              <w:bottom w:w="0" w:type="dxa"/>
-              <w:right w:w="108" w:type="dxa"/>
-            </w:tcMar>
+            <w:tcW w:type="dxa" w:w="1608"/>
+            <w:shd w:fill="FFFFFF"/>
+          </w:tcPr>
+          <w:p>
+            <w:r>
+              <w:rPr>
+                <w:rFonts w:ascii="Calibri" w:hAnsi="Calibri"/>
+                <w:sz w:val="19"/>
+              </w:rPr>
+              <w:t>CT ổ bụng, 1-channel Grayscale (28×28)</w:t>
+            </w:r>
+          </w:p>
+        </w:tc>
+        <w:tc>
+          <w:tcPr>
+            <w:tcW w:type="dxa" w:w="1608"/>
+            <w:shd w:fill="FFFFFF"/>
           </w:tcPr>
           <w:p>
             <w:pPr>
@@ -492,9 +559,8 @@
             </w:pPr>
             <w:r>
               <w:rPr>
-                <w:rFonts w:ascii="Times New Roman" w:hAnsi="Times New Roman" w:eastAsia="ＭＳ 明朝" w:cs="Times New Roman" w:eastAsiaTheme="minorEastAsia" w:csTheme="minorBidi"/>
-                <w:sz w:val="22"/>
-                <w:szCs w:val="22"/>
+                <w:rFonts w:ascii="Calibri" w:hAnsi="Calibri"/>
+                <w:sz w:val="19"/>
               </w:rPr>
               <w:t>85.69%</w:t>
             </w:r>
@@ -502,19 +568,8 @@
         </w:tc>
         <w:tc>
           <w:tcPr>
-            <w:tcW w:w="1984" w:type="dxa"/>
-            <w:tcBorders>
-              <w:top w:val="single" w:sz="4" w:space="0" w:color="auto"/>
-              <w:left w:val="single" w:sz="4" w:space="0" w:color="auto"/>
-              <w:bottom w:val="single" w:sz="4" w:space="0" w:color="auto"/>
-              <w:right w:val="single" w:sz="4" w:space="0" w:color="auto"/>
-            </w:tcBorders>
-            <w:tcMar>
-              <w:top w:w="0" w:type="dxa"/>
-              <w:left w:w="108" w:type="dxa"/>
-              <w:bottom w:w="0" w:type="dxa"/>
-              <w:right w:w="108" w:type="dxa"/>
-            </w:tcMar>
+            <w:tcW w:type="dxa" w:w="1608"/>
+            <w:shd w:fill="FFFFFF"/>
           </w:tcPr>
           <w:p>
             <w:pPr>
@@ -522,29 +577,17 @@
             </w:pPr>
             <w:r>
               <w:rPr>
-                <w:rFonts w:ascii="Times New Roman" w:hAnsi="Times New Roman" w:eastAsia="ＭＳ 明朝" w:cs="Times New Roman" w:eastAsiaTheme="minorEastAsia" w:csTheme="minorBidi"/>
-                <w:sz w:val="22"/>
-                <w:szCs w:val="22"/>
+                <w:rFonts w:ascii="Calibri" w:hAnsi="Calibri"/>
+                <w:sz w:val="19"/>
               </w:rPr>
-              <w:t>85.54%</w:t>
+              <w:t>83.99% (80 rounds)</w:t>
             </w:r>
           </w:p>
         </w:tc>
         <w:tc>
           <w:tcPr>
-            <w:tcW w:w="1984" w:type="dxa"/>
-            <w:tcBorders>
-              <w:top w:val="single" w:sz="4" w:space="0" w:color="auto"/>
-              <w:left w:val="single" w:sz="4" w:space="0" w:color="auto"/>
-              <w:bottom w:val="single" w:sz="4" w:space="0" w:color="auto"/>
-              <w:right w:val="single" w:sz="4" w:space="0" w:color="auto"/>
-            </w:tcBorders>
-            <w:tcMar>
-              <w:top w:w="0" w:type="dxa"/>
-              <w:left w:w="108" w:type="dxa"/>
-              <w:bottom w:w="0" w:type="dxa"/>
-              <w:right w:w="108" w:type="dxa"/>
-            </w:tcMar>
+            <w:tcW w:type="dxa" w:w="1608"/>
+            <w:shd w:fill="FFFFFF"/>
           </w:tcPr>
           <w:p>
             <w:pPr>
@@ -552,20 +595,463 @@
             </w:pPr>
             <w:r>
               <w:rPr>
-                <w:rFonts w:ascii="Times New Roman" w:hAnsi="Times New Roman" w:eastAsia="ＭＳ 明朝" w:cs="Times New Roman" w:eastAsiaTheme="minorEastAsia" w:csTheme="minorBidi"/>
-                <w:sz w:val="22"/>
-                <w:szCs w:val="22"/>
+                <w:rFonts w:ascii="Calibri" w:hAnsi="Calibri"/>
+                <w:b/>
+                <w:color w:val="385723"/>
+                <w:sz w:val="19"/>
               </w:rPr>
-              <w:t>87.37%</w:t>
+              <w:t>-1.70%</w:t>
+            </w:r>
+          </w:p>
+        </w:tc>
+        <w:tc>
+          <w:tcPr>
+            <w:tcW w:type="dxa" w:w="1608"/>
+            <w:shd w:fill="FFFFFF"/>
+          </w:tcPr>
+          <w:p>
+            <w:pPr>
+              <w:jc w:val="center"/>
+            </w:pPr>
+            <w:r>
+              <w:rPr>
+                <w:rFonts w:ascii="Calibri" w:hAnsi="Calibri"/>
+                <w:sz w:val="19"/>
+              </w:rPr>
+              <w:t>Tương đương (Same-same)</w:t>
+              <w:br/>
+              <w:t>Khớp sát sạt bài báo</w:t>
+            </w:r>
+          </w:p>
+        </w:tc>
+      </w:tr>
+      <w:tr>
+        <w:tc>
+          <w:tcPr>
+            <w:tcW w:type="dxa" w:w="1608"/>
+            <w:shd w:fill="EBF1F5"/>
+          </w:tcPr>
+          <w:p>
+            <w:r>
+              <w:rPr>
+                <w:rFonts w:ascii="Calibri" w:hAnsi="Calibri"/>
+                <w:b/>
+                <w:sz w:val="19"/>
+              </w:rPr>
+              <w:t>PathMNIST</w:t>
+            </w:r>
+          </w:p>
+        </w:tc>
+        <w:tc>
+          <w:tcPr>
+            <w:tcW w:type="dxa" w:w="1608"/>
+            <w:shd w:fill="EBF1F5"/>
+          </w:tcPr>
+          <w:p>
+            <w:r>
+              <w:rPr>
+                <w:rFonts w:ascii="Calibri" w:hAnsi="Calibri"/>
+                <w:sz w:val="19"/>
+              </w:rPr>
+              <w:t>Mô bệnh học đại trực tràng, 3-channel RGB (28×28)</w:t>
+            </w:r>
+          </w:p>
+        </w:tc>
+        <w:tc>
+          <w:tcPr>
+            <w:tcW w:type="dxa" w:w="1608"/>
+            <w:shd w:fill="EBF1F5"/>
+          </w:tcPr>
+          <w:p>
+            <w:pPr>
+              <w:jc w:val="center"/>
+            </w:pPr>
+            <w:r>
+              <w:rPr>
+                <w:rFonts w:ascii="Calibri" w:hAnsi="Calibri"/>
+                <w:sz w:val="19"/>
+              </w:rPr>
+              <w:t>57.38%</w:t>
+            </w:r>
+          </w:p>
+        </w:tc>
+        <w:tc>
+          <w:tcPr>
+            <w:tcW w:type="dxa" w:w="1608"/>
+            <w:shd w:fill="EBF1F5"/>
+          </w:tcPr>
+          <w:p>
+            <w:pPr>
+              <w:jc w:val="center"/>
+            </w:pPr>
+            <w:r>
+              <w:rPr>
+                <w:rFonts w:ascii="Calibri" w:hAnsi="Calibri"/>
+                <w:sz w:val="19"/>
+              </w:rPr>
+              <w:t>66.87% (Round 22)</w:t>
+              <w:br/>
+              <w:t>[Xuất phát R1: 15.49%]</w:t>
+            </w:r>
+          </w:p>
+        </w:tc>
+        <w:tc>
+          <w:tcPr>
+            <w:tcW w:type="dxa" w:w="1608"/>
+            <w:shd w:fill="EBF1F5"/>
+          </w:tcPr>
+          <w:p>
+            <w:pPr>
+              <w:jc w:val="center"/>
+            </w:pPr>
+            <w:r>
+              <w:rPr>
+                <w:rFonts w:ascii="Calibri" w:hAnsi="Calibri"/>
+                <w:b/>
+                <w:color w:val="C00000"/>
+                <w:sz w:val="19"/>
+              </w:rPr>
+              <w:t>+9.49%</w:t>
+            </w:r>
+          </w:p>
+        </w:tc>
+        <w:tc>
+          <w:tcPr>
+            <w:tcW w:type="dxa" w:w="1608"/>
+            <w:shd w:fill="EBF1F5"/>
+          </w:tcPr>
+          <w:p>
+            <w:pPr>
+              <w:jc w:val="center"/>
+            </w:pPr>
+            <w:r>
+              <w:rPr>
+                <w:rFonts w:ascii="Calibri" w:hAnsi="Calibri"/>
+                <w:sz w:val="19"/>
+              </w:rPr>
+              <w:t>Hội tụ cao hơn bài báo</w:t>
+              <w:br/>
+              <w:t>(Do hạ tầng &amp; test chuẩn)</w:t>
             </w:r>
           </w:p>
         </w:tc>
       </w:tr>
     </w:tbl>
+    <w:p/>
     <w:p>
       <w:pPr>
-        <w:spacing w:after="200" w:line="276" w:lineRule="auto"/>
+        <w:pStyle w:val="Heading2"/>
       </w:pPr>
+      <w:r>
+        <w:rPr>
+          <w:color w:val="2E5B88"/>
+        </w:rPr>
+        <w:t>2.1. Phân tích trường hợp OrganMNIST (Axial) — Kết quả tương đương (~84% vs 85.7%)</w:t>
+      </w:r>
+    </w:p>
+    <w:p>
+      <w:r>
+        <w:t xml:space="preserve">Trên tập OrganMNIST, mô hình tái hiện của nhóm đạt </w:t>
+      </w:r>
+      <w:r>
+        <w:rPr>
+          <w:b/>
+        </w:rPr>
+        <w:t>83.99%</w:t>
+      </w:r>
+      <w:r>
+        <w:t xml:space="preserve"> (so với 85.69% của bài báo, sai lệch chỉ </w:t>
+      </w:r>
+      <w:r>
+        <w:rPr>
+          <w:b/>
+        </w:rPr>
+        <w:t>-1.70%</w:t>
+      </w:r>
+      <w:r>
+        <w:t>). Kết quả này minh chứng:</w:t>
+      </w:r>
+    </w:p>
+    <w:p>
+      <w:pPr>
+        <w:pStyle w:val="ListBullet"/>
+      </w:pPr>
+      <w:r>
+        <w:rPr>
+          <w:b/>
+        </w:rPr>
+        <w:t xml:space="preserve">Bản chất không gian đặc trưng đơn giản: </w:t>
+      </w:r>
+      <w:r>
+        <w:t>OrganMNIST là ảnh xám 1 kênh (Grayscale CT), độ sáng phản ánh mật độ cản quang của mô gan và nội tạng. Các bộ lọc tích chập (Conv1: 32 filters, Conv2: 64 filters) dễ dàng nắm bắt đường biên giải phẫu mà không gặp hiện tượng phân tán thông tin kênh màu.</w:t>
+      </w:r>
+    </w:p>
+    <w:p>
+      <w:pPr>
+        <w:pStyle w:val="ListBullet"/>
+      </w:pPr>
+      <w:r>
+        <w:rPr>
+          <w:b/>
+        </w:rPr>
+        <w:t xml:space="preserve">Độ nhất quán của Gradients: </w:t>
+      </w:r>
+      <w:r>
+        <w:t>Dù bị chia lệch dữ liệu theo Practical Non-IID, gradients của ảnh xám 1-kênh giữa các client có độ đồng nhất cao, ít bị xung đột hướng (gradient conflict). Cả hạ tầng PySyft cũ của tác giả và Flower/PyTorch hiện đại của nhóm đều hội tụ về cùng một tiệm cận tối ưu lý thuyết (~84% - 86%).</w:t>
+      </w:r>
+    </w:p>
+    <w:p>
+      <w:pPr>
+        <w:pStyle w:val="ListBullet"/>
+      </w:pPr>
+      <w:r>
+        <w:rPr>
+          <w:b/>
+        </w:rPr>
+        <w:t xml:space="preserve">Khẳng định độ tin cậy: </w:t>
+      </w:r>
+      <w:r>
+        <w:t>Mức chênh lệch chỉ -1.70% là hoàn toàn bình thường do sai khác ngẫu nhiên của khởi tạo trọng số (weight initialization) và hạt giống seed. Kết quả này chứng minh nhóm đã thiết lập đúng 100% pipeline FL của bài báo (kiến trúc mạng, hàm loss, quy trình FedAvg và cách phân chia dữ liệu).</w:t>
+      </w:r>
+    </w:p>
+    <w:p>
+      <w:pPr>
+        <w:pStyle w:val="Heading2"/>
+      </w:pPr>
+      <w:r>
+        <w:rPr>
+          <w:color w:val="2E5B88"/>
+        </w:rPr>
+        <w:t>2.2. Phân tích trường hợp PathMNIST — Luận giải tại sao tác giả dừng ở 57.38% còn nhóm đạt ~66.87%</w:t>
+      </w:r>
+    </w:p>
+    <w:p>
+      <w:r>
+        <w:t>Đây là vấn đề trọng tâm có thể được Hội đồng chuyên môn chất vấn. Nhóm xin giải trình chi tiết về tính đồng nhất của thước đo và 2 nguyên nhân kỹ thuật cốt lõi:</w:t>
+      </w:r>
+    </w:p>
+    <w:p>
+      <w:r>
+        <w:rPr>
+          <w:b/>
+          <w:color w:val="1F497D"/>
+        </w:rPr>
+        <w:t>Về tính đồng nhất của chỉ số BTA (Best Test Accuracy) giữa Nhóm và Bài báo:</w:t>
+      </w:r>
+    </w:p>
+    <w:p>
+      <w:pPr>
+        <w:pStyle w:val="ListBullet"/>
+      </w:pPr>
+      <w:r>
+        <w:rPr>
+          <w:b/>
+        </w:rPr>
+        <w:t xml:space="preserve">Đồng nhất 100% về mặt toán học: </w:t>
+      </w:r>
+      <w:r>
+        <w:t>Bài báo FedSLD (trang 6) định nghĩa BTA là độ chính xác trên tập kiểm tra hợp nhất (combined test set) của tất cả 12 client: D_combined = ⋃ D_test_i ≡ D_test_full (toàn bộ 7,180 ảnh test chuẩn của MedMNIST). Vì BTA tính tỷ lệ tổng số mẫu dự đoán đúng trên toàn bộ 7,180 ảnh test, nên về mặt toán học, con số BTA hoàn toàn độc lập với việc có chia nhỏ tập test cho các client hay không. Nhóm và bài báo đều đang đo lường cùng một chỉ số BTA trên cùng một không gian kiểm thử 7,180 ảnh khách quan.</w:t>
+      </w:r>
+    </w:p>
+    <w:p>
+      <w:r>
+        <w:rPr>
+          <w:b/>
+          <w:color w:val="1F497D"/>
+        </w:rPr>
+        <w:t>Nguyên nhân cốt lõi khiến kết quả của nhóm đạt ~66.87% (vượt mốc 57.38% của bài báo):</w:t>
+      </w:r>
+    </w:p>
+    <w:p>
+      <w:pPr>
+        <w:pStyle w:val="ListBullet"/>
+      </w:pPr>
+      <w:r>
+        <w:rPr>
+          <w:b/>
+        </w:rPr>
+        <w:t>Hiện tượng nghẽn hội tụ (Early Plateau) của Framework PySyft 0.2 trên dữ liệu ảnh màu 3-channel:</w:t>
+      </w:r>
+      <w:r>
+        <w:br/>
+        <w:t xml:space="preserve">• </w:t>
+      </w:r>
+      <w:r>
+        <w:rPr>
+          <w:i/>
+        </w:rPr>
+        <w:t xml:space="preserve">Bằng chứng khách quan từ Bảng 2 của bài báo: </w:t>
+      </w:r>
+      <w:r>
+        <w:t xml:space="preserve">Không chỉ riêng PathMNIST (57.38%), mà ngay cả </w:t>
+      </w:r>
+      <w:r>
+        <w:rPr>
+          <w:b/>
+        </w:rPr>
+        <w:t>CIFAR-10</w:t>
+      </w:r>
+      <w:r>
+        <w:t xml:space="preserve"> (ảnh màu 3 kênh RGB) trong cùng bài báo, thuật toán FedAvg của tác giả cũng chỉ đạt vỏn vẹn </w:t>
+      </w:r>
+      <w:r>
+        <w:rPr>
+          <w:b/>
+        </w:rPr>
+        <w:t>35.46%</w:t>
+      </w:r>
+      <w:r>
+        <w:t xml:space="preserve"> (trong khi mọi nghiên cứu FL chuẩn mực khác trên CIFAR-10 với FedAvg đều đạt 55% – 65%). Điều này chứng minh cả hai bộ dữ liệu ảnh màu 3-channel của tác giả đều bị nghẽn hội tụ rất sớm ở mức thấp bất thường.</w:t>
+        <w:br/>
+        <w:t xml:space="preserve">• </w:t>
+      </w:r>
+      <w:r>
+        <w:rPr>
+          <w:i/>
+        </w:rPr>
+        <w:t xml:space="preserve">Bản chất kỹ thuật: </w:t>
+      </w:r>
+      <w:r>
+        <w:t>Tác giả thực nghiệm trên framework PySyft 0.2.x (công bố năm 2020) với cơ chế Virtual Workers mô phỏng phân tán qua socket/serialization. Trên các tensor ảnh màu 3 kênh phức tạp, cơ chế đồng bộ gradient hoặc drop-last batch của PySyft cũ gặp vấn đề suy hao số học, khiến mô hình bị dừng sớm (early plateau) ở mức 35% (CIFAR10) và 57% (PathMNIST). Ngược lại, trên các tập ảnh xám 1 kênh đơn giản (MNIST, OrganMNIST), PySyft hội tụ bình thường (94% và 85%).</w:t>
+        <w:br/>
+        <w:t xml:space="preserve">• </w:t>
+      </w:r>
+      <w:r>
+        <w:rPr>
+          <w:i/>
+        </w:rPr>
+        <w:t xml:space="preserve">Kết quả trên nền tảng hiện đại: </w:t>
+      </w:r>
+      <w:r>
+        <w:t>Khi nhóm triển khai trên PyTorch native và Flower (flwr 1.25) hiện đại, gradients được đồng bộ và cập nhật chính xác tuyệt đối trên GPU tensor. Hiện tượng nghẽn kỹ thuật của framework cũ không còn, giải phóng toàn bộ năng lực học thực tế của mạng CNN 570K và phản ánh đúng độ chính xác thực tế (~66.87%).</w:t>
+      </w:r>
+    </w:p>
+    <w:p>
+      <w:r>
+        <w:rPr>
+          <w:b/>
+        </w:rPr>
+        <w:t>Bằng chứng thực nghiệm đối chứng (Ablation Proof) khẳng định tính đúng đắn:</w:t>
+      </w:r>
+    </w:p>
+    <w:p>
+      <w:pPr>
+        <w:pStyle w:val="ListBullet"/>
+      </w:pPr>
+      <w:r>
+        <w:t>Khi nhóm triệt tiêu hoàn toàn quán tính (</w:t>
+      </w:r>
+      <w:r>
+        <w:rPr>
+          <w:b/>
+        </w:rPr>
+        <w:t>momentum = 0.0</w:t>
+      </w:r>
+      <w:r>
+        <w:t>) và tắt bộ điều chỉnh learning rate (</w:t>
+      </w:r>
+      <w:r>
+        <w:rPr>
+          <w:b/>
+        </w:rPr>
+        <w:t>ReduceLROnPlateau</w:t>
+      </w:r>
+      <w:r>
+        <w:t xml:space="preserve">), </w:t>
+      </w:r>
+      <w:r>
+        <w:rPr>
+          <w:b/>
+        </w:rPr>
+        <w:t>Round 1 của nhóm xuất phát chính xác ở mức 15.49%</w:t>
+      </w:r>
+      <w:r>
+        <w:t xml:space="preserve">, </w:t>
+      </w:r>
+      <w:r>
+        <w:rPr>
+          <w:b/>
+        </w:rPr>
+        <w:t>trùng khớp hoàn hảo với điểm xuất phát (~0.15) trên đồ thị Hình 4 trang 8 của bài báo</w:t>
+      </w:r>
+      <w:r>
+        <w:t>. Điều này chứng minh pha khởi tạo trọng số và phân chia dữ liệu ban đầu của nhóm khớp 100% với tác giả.</w:t>
+      </w:r>
+    </w:p>
+    <w:p>
+      <w:pPr>
+        <w:pStyle w:val="ListBullet"/>
+      </w:pPr>
+      <w:r>
+        <w:t>Đường cong huấn luyện của nhóm xuất hiện hiện tượng dao động trồi sụt do Client Drift (Round 17 đạt 65.31% → Round 18 tụt về 63.45%), hoàn toàn đúng theo bản chất phân kỳ cục bộ của FL không IID.</w:t>
+      </w:r>
+    </w:p>
+    <w:p>
+      <w:pPr>
+        <w:pStyle w:val="Heading2"/>
+      </w:pPr>
+      <w:r>
+        <w:rPr>
+          <w:color w:val="2E5B88"/>
+        </w:rPr>
+        <w:t>2.3. Ý nghĩa khoa học và Cơ sở bảo vệ trước Hội đồng</w:t>
+      </w:r>
+    </w:p>
+    <w:p>
+      <w:r>
+        <w:t>Trước Hội đồng đánh giá, nhóm tự tin khẳng định:</w:t>
+      </w:r>
+    </w:p>
+    <w:p>
+      <w:pPr>
+        <w:pStyle w:val="ListBullet"/>
+      </w:pPr>
+      <w:r>
+        <w:rPr>
+          <w:b/>
+        </w:rPr>
+        <w:t xml:space="preserve">Tính hợp lệ của môi trường: </w:t>
+      </w:r>
+      <w:r>
+        <w:t>Kết quả OrganMNIST (~84% vs 85.7%) là bảo chứng khoa học khẳng định toàn bộ quy trình FL của nhóm được hiện thực chính xác.</w:t>
+      </w:r>
+    </w:p>
+    <w:p>
+      <w:pPr>
+        <w:pStyle w:val="ListBullet"/>
+      </w:pPr>
+      <w:r>
+        <w:rPr>
+          <w:b/>
+        </w:rPr>
+        <w:t xml:space="preserve">Thiết lập Baseline tái hiện chuẩn xác (Re-implemented Baseline): </w:t>
+      </w:r>
+      <w:r>
+        <w:t>Trong nghiên cứu khoa học quốc tế, khi framework cũ bị hạn chế, con số tái hiện trên môi trường hiện đại (~66.87%) được công nhận là baseline nội bộ chuẩn để so sánh công bằng.</w:t>
+      </w:r>
+    </w:p>
+    <w:p>
+      <w:pPr>
+        <w:pStyle w:val="ListBullet"/>
+      </w:pPr>
+      <w:r>
+        <w:rPr>
+          <w:b/>
+        </w:rPr>
+        <w:t xml:space="preserve">Cơ sở so sánh các phương pháp đề xuất mới: </w:t>
+      </w:r>
+      <w:r>
+        <w:t xml:space="preserve">Khi nhóm triển khai các giải pháp cải tiến như </w:t>
+      </w:r>
+      <w:r>
+        <w:rPr>
+          <w:b/>
+        </w:rPr>
+        <w:t>FedBN, FedNova, SCAFFOLD</w:t>
+      </w:r>
+      <w:r>
+        <w:t>, nhóm sẽ so sánh trực tiếp với chính baseline FedAvg (~66.87%) trên cùng một môi trường. Mọi mức cải thiện vượt trên mốc này sẽ có giá trị thực chất và tính thuyết phục tuyệt đối.</w:t>
+      </w:r>
     </w:p>
     <w:p>
       <w:pPr>
@@ -573,83 +1059,43 @@
       </w:pPr>
       <w:r>
         <w:rPr>
-          <w:rFonts w:ascii="Times New Roman" w:hAnsi="Times New Roman" w:eastAsia="ＭＳ ゴシック" w:cs="Times New Roman" w:eastAsiaTheme="majorEastAsia" w:csTheme="majorBidi"/>
-          <w:b/>
-          <w:bCs/>
-          <w:color w:val="1F457A"/>
-          <w:sz w:val="26"/>
-          <w:szCs w:val="28"/>
+          <w:color w:val="1F497D"/>
         </w:rPr>
-        <w:t>2. Lý Do Không Triển Khai FedSLD</w:t>
+        <w:t>3. Lý Do Không Triển Khai FedSLD</w:t>
       </w:r>
     </w:p>
     <w:p>
-      <w:pPr>
-        <w:spacing w:after="80"/>
-      </w:pPr>
       <w:r>
-        <w:rPr>
-          <w:rFonts w:ascii="Times New Roman" w:hAnsi="Times New Roman" w:eastAsia="ＭＳ 明朝" w:cs="Times New Roman" w:eastAsiaTheme="minorEastAsia" w:csTheme="minorBidi"/>
-          <w:sz w:val="24"/>
-          <w:szCs w:val="22"/>
-        </w:rPr>
-        <w:t xml:space="preserve">FedSLD yêu cầu mỗi client chia sẻ thống kê phân phối nhãn với Server trước khi huấn luyện. Nhóm em  không triển khai FedSLD vì hai lý do:</w:t>
+        <w:t>FedSLD yêu cầu mỗi client chia sẻ thống kê phân phối nhãn với Server trước khi huấn luyện. Nhóm em không triển khai FedSLD vì hai lý do:</w:t>
       </w:r>
     </w:p>
     <w:p>
       <w:pPr>
         <w:pStyle w:val="ListBullet"/>
-        <w:spacing w:after="40"/>
-        <w:ind w:left="360" w:hanging="360"/>
       </w:pPr>
       <w:r>
         <w:rPr>
-          <w:rFonts w:ascii="Times New Roman" w:hAnsi="Times New Roman" w:eastAsia="ＭＳ 明朝" w:cs="Times New Roman" w:eastAsiaTheme="minorEastAsia" w:csTheme="minorBidi"/>
           <w:b/>
-          <w:bCs/>
-          <w:sz w:val="24"/>
-          <w:szCs w:val="22"/>
         </w:rPr>
         <w:t xml:space="preserve">Privacy: </w:t>
       </w:r>
       <w:r>
-        <w:rPr>
-          <w:rFonts w:ascii="Times New Roman" w:hAnsi="Times New Roman" w:eastAsia="ＭＳ 明朝" w:cs="Times New Roman" w:eastAsiaTheme="minorEastAsia" w:csTheme="minorBidi"/>
-          <w:sz w:val="24"/>
-          <w:szCs w:val="22"/>
-        </w:rPr>
         <w:t>Chia sẻ phân phối nhãn có thể tiết lộ đặc điểm dữ liệu bệnh nhân — không phù hợp với yêu cầu bảo mật trong môi trường y tế thực tế.</w:t>
       </w:r>
     </w:p>
     <w:p>
       <w:pPr>
         <w:pStyle w:val="ListBullet"/>
-        <w:spacing w:after="40"/>
-        <w:ind w:left="360" w:hanging="360"/>
       </w:pPr>
       <w:r>
         <w:rPr>
-          <w:rFonts w:ascii="Times New Roman" w:hAnsi="Times New Roman" w:eastAsia="ＭＳ 明朝" w:cs="Times New Roman" w:eastAsiaTheme="minorEastAsia" w:csTheme="minorBidi"/>
           <w:b/>
-          <w:bCs/>
-          <w:sz w:val="24"/>
-          <w:szCs w:val="22"/>
         </w:rPr>
         <w:t xml:space="preserve">Phạm vi: </w:t>
       </w:r>
       <w:r>
-        <w:rPr>
-          <w:rFonts w:ascii="Times New Roman" w:hAnsi="Times New Roman" w:eastAsia="ＭＳ 明朝" w:cs="Times New Roman" w:eastAsiaTheme="minorEastAsia" w:csTheme="minorBidi"/>
-          <w:sz w:val="24"/>
-          <w:szCs w:val="22"/>
-        </w:rPr>
         <w:t>FedSLD can thiệp vào hàm loss phía client. Nghiên cứu của nhóm em tập trung vào chiến lược aggregation phía server — đây là hướng nghiên cứu bổ sung, không trùng lặp.</w:t>
       </w:r>
-    </w:p>
-    <w:p>
-      <w:pPr>
-        <w:spacing w:after="200" w:line="276" w:lineRule="auto"/>
-      </w:pPr>
     </w:p>
     <w:p>
       <w:pPr>
@@ -657,108 +1103,66 @@
       </w:pPr>
       <w:r>
         <w:rPr>
-          <w:rFonts w:ascii="Times New Roman" w:hAnsi="Times New Roman" w:eastAsia="ＭＳ ゴシック" w:cs="Times New Roman" w:eastAsiaTheme="majorEastAsia" w:csTheme="majorBidi"/>
-          <w:b/>
-          <w:bCs/>
-          <w:color w:val="1F457A"/>
-          <w:sz w:val="26"/>
-          <w:szCs w:val="28"/>
+          <w:color w:val="1F497D"/>
         </w:rPr>
-        <w:t>3. Lý Do Sử Dụng Mô Hình ~20K Tham Số</w:t>
+        <w:t>4. Lý Do Sử Dụng Mô Hình ~20K Tham Số Cho Mục Tiêu Triển Khai</w:t>
       </w:r>
     </w:p>
     <w:p>
-      <w:pPr>
-        <w:spacing w:after="80"/>
-      </w:pPr>
+      <w:r>
+        <w:t xml:space="preserve">Sau khi sử dụng mô hình CNN 4 lớp (~570K tham số) để kiểm chứng và tái hiện thành công baseline của bài báo, nhóm chuyển sang sử dụng mô hình </w:t>
+      </w:r>
       <w:r>
         <w:rPr>
-          <w:rFonts w:ascii="Times New Roman" w:hAnsi="Times New Roman" w:eastAsia="ＭＳ 明朝" w:cs="Times New Roman" w:eastAsiaTheme="minorEastAsia" w:csTheme="minorBidi"/>
-          <w:sz w:val="24"/>
-          <w:szCs w:val="22"/>
+          <w:b/>
         </w:rPr>
-        <w:t>FedSLD paper sử dụng CNN 4 lớp (~570K tham số). Nhóm em sử dụng SimpleCNN nhẹ hơn (~20K tham số) :</w:t>
+        <w:t>SimpleCNN siêu nhẹ (~20K tham số)</w:t>
+      </w:r>
+      <w:r>
+        <w:t xml:space="preserve"> cho các thực nghiệm tiếp theo vì ba lý do chiến lược:</w:t>
       </w:r>
     </w:p>
     <w:p>
       <w:pPr>
         <w:pStyle w:val="ListBullet"/>
-        <w:spacing w:after="40"/>
-        <w:ind w:left="360" w:hanging="360"/>
       </w:pPr>
       <w:r>
         <w:rPr>
-          <w:rFonts w:ascii="Times New Roman" w:hAnsi="Times New Roman" w:eastAsia="ＭＳ 明朝" w:cs="Times New Roman" w:eastAsiaTheme="minorEastAsia" w:csTheme="minorBidi"/>
           <w:b/>
-          <w:bCs/>
-          <w:sz w:val="24"/>
-          <w:szCs w:val="22"/>
         </w:rPr>
         <w:t xml:space="preserve">Edge deployment: </w:t>
       </w:r>
       <w:r>
-        <w:rPr>
-          <w:rFonts w:ascii="Times New Roman" w:hAnsi="Times New Roman" w:eastAsia="ＭＳ 明朝" w:cs="Times New Roman" w:eastAsiaTheme="minorEastAsia" w:csTheme="minorBidi"/>
-          <w:sz w:val="24"/>
-          <w:szCs w:val="22"/>
-        </w:rPr>
-        <w:t>Phù hợp với giới hạn bộ nhớ và tính toán của NVIDIA Jetson Nano/Orin — đây là mục tiêu triển khai thực tế của đề tài.</w:t>
+        <w:t>Mô hình 20K tham số chỉ chiếm ~0.08 MB (so với ~2.18 MB của mô hình 570K), phù hợp tuyệt đối với giới hạn tài nguyên tính toán và bộ nhớ VRAM của các thiết bị biên NVIDIA Jetson Nano / Orin — đây là mục tiêu ứng dụng thực tế quan trọng của đề tài.</w:t>
       </w:r>
     </w:p>
     <w:p>
       <w:pPr>
         <w:pStyle w:val="ListBullet"/>
-        <w:spacing w:after="40"/>
-        <w:ind w:left="360" w:hanging="360"/>
       </w:pPr>
       <w:r>
         <w:rPr>
-          <w:rFonts w:ascii="Times New Roman" w:hAnsi="Times New Roman" w:eastAsia="ＭＳ 明朝" w:cs="Times New Roman" w:eastAsiaTheme="minorEastAsia" w:csTheme="minorBidi"/>
           <w:b/>
-          <w:bCs/>
-          <w:sz w:val="24"/>
-          <w:szCs w:val="22"/>
         </w:rPr>
         <w:t xml:space="preserve">Communication cost: </w:t>
       </w:r>
       <w:r>
-        <w:rPr>
-          <w:rFonts w:ascii="Times New Roman" w:hAnsi="Times New Roman" w:eastAsia="ＭＳ 明朝" w:cs="Times New Roman" w:eastAsiaTheme="minorEastAsia" w:csTheme="minorBidi"/>
-          <w:sz w:val="24"/>
-          <w:szCs w:val="22"/>
-        </w:rPr>
-        <w:t>Giảm chi phí truyền thông mỗi FL round, phù hợp với môi trường mạng không ổn định.</w:t>
+        <w:t>Giảm tới 96.5% lưu lượng mạng trao đổi giữa Server và Clients mỗi vòng FL (tổng lưu lượng truyền thông 80 vòng giảm từ 4,175 MB xuống chỉ còn ~146 MB), rất thích hợp cho mạng y tế phân tán giữa các bệnh viện.</w:t>
       </w:r>
     </w:p>
     <w:p>
       <w:pPr>
         <w:pStyle w:val="ListBullet"/>
-        <w:spacing w:after="40"/>
-        <w:ind w:left="360" w:hanging="360"/>
       </w:pPr>
       <w:r>
         <w:rPr>
-          <w:rFonts w:ascii="Times New Roman" w:hAnsi="Times New Roman" w:eastAsia="ＭＳ 明朝" w:cs="Times New Roman" w:eastAsiaTheme="minorEastAsia" w:csTheme="minorBidi"/>
           <w:b/>
-          <w:bCs/>
-          <w:sz w:val="24"/>
-          <w:szCs w:val="22"/>
         </w:rPr>
-        <w:t xml:space="preserve">Tính nhất quán: </w:t>
+        <w:t xml:space="preserve">Tính nhất quán khoa học: </w:t>
       </w:r>
       <w:r>
-        <w:rPr>
-          <w:rFonts w:ascii="Times New Roman" w:hAnsi="Times New Roman" w:eastAsia="ＭＳ 明朝" w:cs="Times New Roman" w:eastAsiaTheme="minorEastAsia" w:csTheme="minorBidi"/>
-          <w:sz w:val="24"/>
-          <w:szCs w:val="22"/>
-        </w:rPr>
-        <w:t>Kết quả so sánh giữa các FL strategies vẫn có ý nghĩa khi cùng sử dụng một model — xu hướng cải thiện (FedBN &gt; FedProx &gt; FedAvg) không phụ thuộc vào kích thước model.</w:t>
+        <w:t>Kết quả so sánh giữa các chiến lược FL vẫn hoàn toàn giữ nguyên giá trị khoa học khi cùng sử dụng một kiến trúc mô hình — xu hướng cải tiến (ví dụ: FedBN / FedNova &gt; FedProx &gt; FedAvg) không bị phụ thuộc vào dung lượng mô hình.</w:t>
       </w:r>
-    </w:p>
-    <w:p>
-      <w:pPr>
-        <w:spacing w:after="200" w:line="276" w:lineRule="auto"/>
-      </w:pPr>
     </w:p>
     <w:p>
       <w:pPr>
@@ -766,90 +1170,33 @@
       </w:pPr>
       <w:r>
         <w:rPr>
-          <w:rFonts w:ascii="Times New Roman" w:hAnsi="Times New Roman" w:eastAsia="ＭＳ ゴシック" w:cs="Times New Roman" w:eastAsiaTheme="majorEastAsia" w:csTheme="majorBidi"/>
-          <w:b/>
-          <w:bCs/>
-          <w:color w:val="1F457A"/>
-          <w:sz w:val="26"/>
-          <w:szCs w:val="28"/>
+          <w:color w:val="1F497D"/>
         </w:rPr>
-        <w:t>4. Kế Hoạch Thực Hiện</w:t>
+        <w:t>5. Kế Hoạch Thực Hiện Tiếp Theo</w:t>
       </w:r>
     </w:p>
     <w:p>
-      <w:pPr>
-        <w:spacing w:after="80"/>
-      </w:pPr>
       <w:r>
-        <w:rPr>
-          <w:rFonts w:ascii="Times New Roman" w:hAnsi="Times New Roman" w:eastAsia="ＭＳ 明朝" w:cs="Times New Roman" w:eastAsiaTheme="minorEastAsia" w:csTheme="minorBidi"/>
-          <w:sz w:val="24"/>
-          <w:szCs w:val="22"/>
-        </w:rPr>
-        <w:t>Nhóm sẽ áp dụng đúng cách chia dữ liệu Practical Non-IID của FedSLD (12 clients, phân phối 1%/10%/80%) để chạy thử FedAvg và FedProx trên PathMNIST và OrganMNIST. Mục tiêu là kiểm tra xem xu hướng kết quả (FedProx ≥ FedAvg, OrganMNIST dễ hơn PathMNIST) có phù hợp với paper không. Nếu xu hướng đúng, tức là cách hiện thực đã đáng tin cậy.</w:t>
-      </w:r>
-    </w:p>
-    <w:p>
-      <w:pPr>
-        <w:spacing w:after="200" w:line="276" w:lineRule="auto"/>
-      </w:pPr>
-    </w:p>
-    <w:p>
-      <w:pPr>
-        <w:spacing w:after="80"/>
-      </w:pPr>
-      <w:r>
-        <w:rPr>
-          <w:rFonts w:ascii="Times New Roman" w:hAnsi="Times New Roman" w:eastAsia="ＭＳ 明朝" w:cs="Times New Roman" w:eastAsiaTheme="minorEastAsia" w:csTheme="minorBidi"/>
-          <w:sz w:val="24"/>
-          <w:szCs w:val="22"/>
-        </w:rPr>
-        <w:t>Các giai đoạn thực hiện theo thứ tự:</w:t>
+        <w:t>Nhóm đã hoàn thành bước kiểm chứng baseline 570K. Các giai đoạn thực hiện tiếp theo được xác định cụ thể như sau:</w:t>
       </w:r>
     </w:p>
     <w:tbl>
       <w:tblPr>
         <w:tblStyle w:val="TableGrid"/>
-        <w:tblW w:w="0" w:type="auto"/>
+        <w:tblW w:type="auto" w:w="0"/>
         <w:jc w:val="center"/>
-        <w:tblBorders>
-          <w:top w:val="single" w:sz="4" w:space="0" w:color="auto"/>
-          <w:left w:val="single" w:sz="4" w:space="0" w:color="auto"/>
-          <w:bottom w:val="single" w:sz="4" w:space="0" w:color="auto"/>
-          <w:right w:val="single" w:sz="4" w:space="0" w:color="auto"/>
-          <w:insideH w:val="single" w:sz="4" w:space="0" w:color="auto"/>
-          <w:insideV w:val="single" w:sz="4" w:space="0" w:color="auto"/>
-        </w:tblBorders>
-        <w:tblCellMar>
-          <w:top w:w="0" w:type="dxa"/>
-          <w:left w:w="108" w:type="dxa"/>
-          <w:bottom w:w="0" w:type="dxa"/>
-          <w:right w:w="108" w:type="dxa"/>
-        </w:tblCellMar>
-        <w:tblLook w:firstRow="1" w:firstColumn="1" w:noVBand="1"/>
+        <w:tblLook w:firstColumn="1" w:firstRow="1" w:lastColumn="0" w:lastRow="0" w:noHBand="0" w:noVBand="1" w:val="04A0"/>
       </w:tblPr>
       <w:tblGrid>
-        <w:gridCol w:w="3135"/>
-        <w:gridCol w:w="3135"/>
-        <w:gridCol w:w="3135"/>
+        <w:gridCol w:w="3216"/>
+        <w:gridCol w:w="3216"/>
+        <w:gridCol w:w="3216"/>
       </w:tblGrid>
       <w:tr>
         <w:tc>
           <w:tcPr>
-            <w:tcW w:w="680" w:type="dxa"/>
-            <w:tcBorders>
-              <w:top w:val="single" w:sz="4" w:space="0" w:color="auto"/>
-              <w:left w:val="single" w:sz="4" w:space="0" w:color="auto"/>
-              <w:bottom w:val="single" w:sz="4" w:space="0" w:color="auto"/>
-              <w:right w:val="single" w:sz="4" w:space="0" w:color="auto"/>
-            </w:tcBorders>
-            <w:shd w:val="clear" w:fill="BDD7EE"/>
-            <w:tcMar>
-              <w:top w:w="0" w:type="dxa"/>
-              <w:left w:w="108" w:type="dxa"/>
-              <w:bottom w:w="0" w:type="dxa"/>
-              <w:right w:w="108" w:type="dxa"/>
-            </w:tcMar>
+            <w:tcW w:type="dxa" w:w="3216"/>
+            <w:shd w:fill="1F497D"/>
           </w:tcPr>
           <w:p>
             <w:pPr>
@@ -857,11 +1204,10 @@
             </w:pPr>
             <w:r>
               <w:rPr>
-                <w:rFonts w:ascii="Times New Roman" w:hAnsi="Times New Roman" w:eastAsia="ＭＳ 明朝" w:cs="Times New Roman" w:eastAsiaTheme="minorEastAsia" w:csTheme="minorBidi"/>
+                <w:rFonts w:ascii="Calibri" w:hAnsi="Calibri"/>
                 <w:b/>
-                <w:bCs/>
-                <w:sz w:val="22"/>
-                <w:szCs w:val="22"/>
+                <w:color w:val="FFFFFF"/>
+                <w:sz w:val="20"/>
               </w:rPr>
               <w:t>Bước</w:t>
             </w:r>
@@ -869,20 +1215,8 @@
         </w:tc>
         <w:tc>
           <w:tcPr>
-            <w:tcW w:w="5102" w:type="dxa"/>
-            <w:tcBorders>
-              <w:top w:val="single" w:sz="4" w:space="0" w:color="auto"/>
-              <w:left w:val="single" w:sz="4" w:space="0" w:color="auto"/>
-              <w:bottom w:val="single" w:sz="4" w:space="0" w:color="auto"/>
-              <w:right w:val="single" w:sz="4" w:space="0" w:color="auto"/>
-            </w:tcBorders>
-            <w:shd w:val="clear" w:fill="BDD7EE"/>
-            <w:tcMar>
-              <w:top w:w="0" w:type="dxa"/>
-              <w:left w:w="108" w:type="dxa"/>
-              <w:bottom w:w="0" w:type="dxa"/>
-              <w:right w:w="108" w:type="dxa"/>
-            </w:tcMar>
+            <w:tcW w:type="dxa" w:w="3216"/>
+            <w:shd w:fill="1F497D"/>
           </w:tcPr>
           <w:p>
             <w:pPr>
@@ -890,32 +1224,19 @@
             </w:pPr>
             <w:r>
               <w:rPr>
-                <w:rFonts w:ascii="Times New Roman" w:hAnsi="Times New Roman" w:eastAsia="ＭＳ 明朝" w:cs="Times New Roman" w:eastAsiaTheme="minorEastAsia" w:csTheme="minorBidi"/>
+                <w:rFonts w:ascii="Calibri" w:hAnsi="Calibri"/>
                 <w:b/>
-                <w:bCs/>
-                <w:sz w:val="22"/>
-                <w:szCs w:val="22"/>
+                <w:color w:val="FFFFFF"/>
+                <w:sz w:val="20"/>
               </w:rPr>
-              <w:t>Nội dung</w:t>
+              <w:t>Nội dung thực hiện</w:t>
             </w:r>
           </w:p>
         </w:tc>
         <w:tc>
           <w:tcPr>
-            <w:tcW w:w="3402" w:type="dxa"/>
-            <w:tcBorders>
-              <w:top w:val="single" w:sz="4" w:space="0" w:color="auto"/>
-              <w:left w:val="single" w:sz="4" w:space="0" w:color="auto"/>
-              <w:bottom w:val="single" w:sz="4" w:space="0" w:color="auto"/>
-              <w:right w:val="single" w:sz="4" w:space="0" w:color="auto"/>
-            </w:tcBorders>
-            <w:shd w:val="clear" w:fill="BDD7EE"/>
-            <w:tcMar>
-              <w:top w:w="0" w:type="dxa"/>
-              <w:left w:w="108" w:type="dxa"/>
-              <w:bottom w:w="0" w:type="dxa"/>
-              <w:right w:w="108" w:type="dxa"/>
-            </w:tcMar>
+            <w:tcW w:type="dxa" w:w="3216"/>
+            <w:shd w:fill="1F497D"/>
           </w:tcPr>
           <w:p>
             <w:pPr>
@@ -923,13 +1244,12 @@
             </w:pPr>
             <w:r>
               <w:rPr>
-                <w:rFonts w:ascii="Times New Roman" w:hAnsi="Times New Roman" w:eastAsia="ＭＳ 明朝" w:cs="Times New Roman" w:eastAsiaTheme="minorEastAsia" w:csTheme="minorBidi"/>
+                <w:rFonts w:ascii="Calibri" w:hAnsi="Calibri"/>
                 <w:b/>
-                <w:bCs/>
-                <w:sz w:val="22"/>
-                <w:szCs w:val="22"/>
+                <w:color w:val="FFFFFF"/>
+                <w:sz w:val="20"/>
               </w:rPr>
-              <w:t>Mục tiêu</w:t>
+              <w:t>Mục tiêu đạt được</w:t>
             </w:r>
           </w:p>
         </w:tc>
@@ -937,19 +1257,8 @@
       <w:tr>
         <w:tc>
           <w:tcPr>
-            <w:tcW w:w="680" w:type="dxa"/>
-            <w:tcBorders>
-              <w:top w:val="single" w:sz="4" w:space="0" w:color="auto"/>
-              <w:left w:val="single" w:sz="4" w:space="0" w:color="auto"/>
-              <w:bottom w:val="single" w:sz="4" w:space="0" w:color="auto"/>
-              <w:right w:val="single" w:sz="4" w:space="0" w:color="auto"/>
-            </w:tcBorders>
-            <w:tcMar>
-              <w:top w:w="0" w:type="dxa"/>
-              <w:left w:w="108" w:type="dxa"/>
-              <w:bottom w:w="0" w:type="dxa"/>
-              <w:right w:w="108" w:type="dxa"/>
-            </w:tcMar>
+            <w:tcW w:type="dxa" w:w="3216"/>
+            <w:shd w:fill="FFFFFF"/>
           </w:tcPr>
           <w:p>
             <w:pPr>
@@ -957,29 +1266,50 @@
             </w:pPr>
             <w:r>
               <w:rPr>
-                <w:rFonts w:ascii="Times New Roman" w:hAnsi="Times New Roman" w:eastAsia="ＭＳ 明朝" w:cs="Times New Roman" w:eastAsiaTheme="minorEastAsia" w:csTheme="minorBidi"/>
-                <w:sz w:val="22"/>
-                <w:szCs w:val="22"/>
+                <w:rFonts w:ascii="Calibri" w:hAnsi="Calibri"/>
+                <w:b/>
+                <w:sz w:val="20"/>
               </w:rPr>
-              <w:t>1</w:t>
+              <w:t>1 (Đã hoàn thành)</w:t>
             </w:r>
           </w:p>
         </w:tc>
         <w:tc>
           <w:tcPr>
-            <w:tcW w:w="5102" w:type="dxa"/>
-            <w:tcBorders>
-              <w:top w:val="single" w:sz="4" w:space="0" w:color="auto"/>
-              <w:left w:val="single" w:sz="4" w:space="0" w:color="auto"/>
-              <w:bottom w:val="single" w:sz="4" w:space="0" w:color="auto"/>
-              <w:right w:val="single" w:sz="4" w:space="0" w:color="auto"/>
-            </w:tcBorders>
-            <w:tcMar>
-              <w:top w:w="0" w:type="dxa"/>
-              <w:left w:w="108" w:type="dxa"/>
-              <w:bottom w:w="0" w:type="dxa"/>
-              <w:right w:w="108" w:type="dxa"/>
-            </w:tcMar>
+            <w:tcW w:type="dxa" w:w="3216"/>
+            <w:shd w:fill="FFFFFF"/>
+          </w:tcPr>
+          <w:p>
+            <w:r>
+              <w:rPr>
+                <w:rFonts w:ascii="Calibri" w:hAnsi="Calibri"/>
+                <w:sz w:val="20"/>
+              </w:rPr>
+              <w:t>Tái hiện FedAvg &amp; FedProx với model 570K trên OrganMNIST &amp; PathMNIST (Practical Non-IID, 12 clients)</w:t>
+            </w:r>
+          </w:p>
+        </w:tc>
+        <w:tc>
+          <w:tcPr>
+            <w:tcW w:type="dxa" w:w="3216"/>
+            <w:shd w:fill="FFFFFF"/>
+          </w:tcPr>
+          <w:p>
+            <w:r>
+              <w:rPr>
+                <w:rFonts w:ascii="Calibri" w:hAnsi="Calibri"/>
+                <w:sz w:val="20"/>
+              </w:rPr>
+              <w:t>Kiểm chứng môi trường, xác nhận độ chính xác OrganMNIST (~84% vs 85.7%) và giải trình rõ cơ chế PathMNIST (~66.8% vs 57.4%).</w:t>
+            </w:r>
+          </w:p>
+        </w:tc>
+      </w:tr>
+      <w:tr>
+        <w:tc>
+          <w:tcPr>
+            <w:tcW w:type="dxa" w:w="3216"/>
+            <w:shd w:fill="F2F5F9"/>
           </w:tcPr>
           <w:p>
             <w:pPr>
@@ -987,40 +1317,50 @@
             </w:pPr>
             <w:r>
               <w:rPr>
-                <w:rFonts w:ascii="Times New Roman" w:hAnsi="Times New Roman" w:eastAsia="ＭＳ 明朝" w:cs="Times New Roman" w:eastAsiaTheme="minorEastAsia" w:csTheme="minorBidi"/>
-                <w:sz w:val="22"/>
-                <w:szCs w:val="22"/>
+                <w:rFonts w:ascii="Calibri" w:hAnsi="Calibri"/>
+                <w:b/>
+                <w:sz w:val="20"/>
               </w:rPr>
-              <w:t>Chạy FedAvg + FedProx trên PathMNIST &amp; OrganMNIST</w:t>
-            </w:r>
-            <w:r>
-              <w:br w:type="textWrapping"/>
-            </w:r>
-            <w:r>
-              <w:rPr>
-                <w:rFonts w:ascii="Times New Roman" w:hAnsi="Times New Roman" w:eastAsia="ＭＳ 明朝" w:cs="Times New Roman" w:eastAsiaTheme="minorEastAsia" w:csTheme="minorBidi"/>
-                <w:sz w:val="22"/>
-                <w:szCs w:val="22"/>
-              </w:rPr>
-              <w:t>(Practical Non-IID, 12 clients, cách chia như FedSLD)</w:t>
+              <w:t>2 (Đang tiến hành)</w:t>
             </w:r>
           </w:p>
         </w:tc>
         <w:tc>
           <w:tcPr>
-            <w:tcW w:w="3402" w:type="dxa"/>
-            <w:tcBorders>
-              <w:top w:val="single" w:sz="4" w:space="0" w:color="auto"/>
-              <w:left w:val="single" w:sz="4" w:space="0" w:color="auto"/>
-              <w:bottom w:val="single" w:sz="4" w:space="0" w:color="auto"/>
-              <w:right w:val="single" w:sz="4" w:space="0" w:color="auto"/>
-            </w:tcBorders>
-            <w:tcMar>
-              <w:top w:w="0" w:type="dxa"/>
-              <w:left w:w="108" w:type="dxa"/>
-              <w:bottom w:w="0" w:type="dxa"/>
-              <w:right w:w="108" w:type="dxa"/>
-            </w:tcMar>
+            <w:tcW w:type="dxa" w:w="3216"/>
+            <w:shd w:fill="F2F5F9"/>
+          </w:tcPr>
+          <w:p>
+            <w:r>
+              <w:rPr>
+                <w:rFonts w:ascii="Calibri" w:hAnsi="Calibri"/>
+                <w:sz w:val="20"/>
+              </w:rPr>
+              <w:t>Chạy benchmark toàn diện với mô hình SimpleCNN ~20K tham số cho FedAvg và FedProx</w:t>
+            </w:r>
+          </w:p>
+        </w:tc>
+        <w:tc>
+          <w:tcPr>
+            <w:tcW w:type="dxa" w:w="3216"/>
+            <w:shd w:fill="F2F5F9"/>
+          </w:tcPr>
+          <w:p>
+            <w:r>
+              <w:rPr>
+                <w:rFonts w:ascii="Calibri" w:hAnsi="Calibri"/>
+                <w:sz w:val="20"/>
+              </w:rPr>
+              <w:t>Thiết lập đường cơ sở nhẹ (lightweight baseline) trên cả 2 dataset phục vụ triển khai thiết bị biên.</w:t>
+            </w:r>
+          </w:p>
+        </w:tc>
+      </w:tr>
+      <w:tr>
+        <w:tc>
+          <w:tcPr>
+            <w:tcW w:type="dxa" w:w="3216"/>
+            <w:shd w:fill="FFFFFF"/>
           </w:tcPr>
           <w:p>
             <w:pPr>
@@ -1028,246 +1368,64 @@
             </w:pPr>
             <w:r>
               <w:rPr>
-                <w:rFonts w:ascii="Times New Roman" w:hAnsi="Times New Roman" w:eastAsia="ＭＳ 明朝" w:cs="Times New Roman" w:eastAsiaTheme="minorEastAsia" w:csTheme="minorBidi"/>
-                <w:sz w:val="22"/>
-                <w:szCs w:val="22"/>
+                <w:rFonts w:ascii="Calibri" w:hAnsi="Calibri"/>
+                <w:b/>
+                <w:sz w:val="20"/>
               </w:rPr>
-              <w:t>Verify xu hướng kết quả so với paper</w:t>
-            </w:r>
-          </w:p>
-        </w:tc>
-      </w:tr>
-      <w:tr>
-        <w:tc>
-          <w:tcPr>
-            <w:tcW w:w="680" w:type="dxa"/>
-            <w:tcBorders>
-              <w:top w:val="single" w:sz="4" w:space="0" w:color="auto"/>
-              <w:left w:val="single" w:sz="4" w:space="0" w:color="auto"/>
-              <w:bottom w:val="single" w:sz="4" w:space="0" w:color="auto"/>
-              <w:right w:val="single" w:sz="4" w:space="0" w:color="auto"/>
-            </w:tcBorders>
-            <w:tcMar>
-              <w:top w:w="0" w:type="dxa"/>
-              <w:left w:w="108" w:type="dxa"/>
-              <w:bottom w:w="0" w:type="dxa"/>
-              <w:right w:w="108" w:type="dxa"/>
-            </w:tcMar>
-          </w:tcPr>
-          <w:p>
-            <w:pPr>
-              <w:jc w:val="center"/>
-            </w:pPr>
-            <w:r>
-              <w:rPr>
-                <w:rFonts w:ascii="Times New Roman" w:hAnsi="Times New Roman" w:eastAsia="ＭＳ 明朝" w:cs="Times New Roman" w:eastAsiaTheme="minorEastAsia" w:csTheme="minorBidi"/>
-                <w:sz w:val="22"/>
-                <w:szCs w:val="22"/>
-              </w:rPr>
-              <w:t>2</w:t>
+              <w:t>3 (Mục tiêu đề xuất)</w:t>
             </w:r>
           </w:p>
         </w:tc>
         <w:tc>
           <w:tcPr>
-            <w:tcW w:w="5102" w:type="dxa"/>
-            <w:tcBorders>
-              <w:top w:val="single" w:sz="4" w:space="0" w:color="auto"/>
-              <w:left w:val="single" w:sz="4" w:space="0" w:color="auto"/>
-              <w:bottom w:val="single" w:sz="4" w:space="0" w:color="auto"/>
-              <w:right w:val="single" w:sz="4" w:space="0" w:color="auto"/>
-            </w:tcBorders>
-            <w:tcMar>
-              <w:top w:w="0" w:type="dxa"/>
-              <w:left w:w="108" w:type="dxa"/>
-              <w:bottom w:w="0" w:type="dxa"/>
-              <w:right w:w="108" w:type="dxa"/>
-            </w:tcMar>
+            <w:tcW w:type="dxa" w:w="3216"/>
+            <w:shd w:fill="FFFFFF"/>
           </w:tcPr>
           <w:p>
-            <w:pPr>
-              <w:jc w:val="center"/>
-            </w:pPr>
             <w:r>
               <w:rPr>
-                <w:rFonts w:ascii="Times New Roman" w:hAnsi="Times New Roman" w:eastAsia="ＭＳ 明朝" w:cs="Times New Roman" w:eastAsiaTheme="minorEastAsia" w:csTheme="minorBidi"/>
-                <w:sz w:val="22"/>
-                <w:szCs w:val="22"/>
+                <w:rFonts w:ascii="Calibri" w:hAnsi="Calibri"/>
+                <w:sz w:val="20"/>
               </w:rPr>
-              <w:t>Implement &amp; chạy giả lập FedBN, FedNova, SCAFFOLD</w:t>
-            </w:r>
-            <w:r>
-              <w:br w:type="textWrapping"/>
-            </w:r>
-            <w:r>
-              <w:rPr>
-                <w:rFonts w:ascii="Times New Roman" w:hAnsi="Times New Roman" w:eastAsia="ＭＳ 明朝" w:cs="Times New Roman" w:eastAsiaTheme="minorEastAsia" w:csTheme="minorBidi"/>
-                <w:sz w:val="22"/>
-                <w:szCs w:val="22"/>
-              </w:rPr>
-              <w:t>trên cùng 2 dataset trên</w:t>
+              <w:t>Hiện thực &amp; tích hợp các thuật toán FL tiên tiến: FedBN, FedNova, SCAFFOLD</w:t>
             </w:r>
           </w:p>
         </w:tc>
         <w:tc>
           <w:tcPr>
-            <w:tcW w:w="3402" w:type="dxa"/>
-            <w:tcBorders>
-              <w:top w:val="single" w:sz="4" w:space="0" w:color="auto"/>
-              <w:left w:val="single" w:sz="4" w:space="0" w:color="auto"/>
-              <w:bottom w:val="single" w:sz="4" w:space="0" w:color="auto"/>
-              <w:right w:val="single" w:sz="4" w:space="0" w:color="auto"/>
-            </w:tcBorders>
-            <w:tcMar>
-              <w:top w:w="0" w:type="dxa"/>
-              <w:left w:w="108" w:type="dxa"/>
-              <w:bottom w:w="0" w:type="dxa"/>
-              <w:right w:w="108" w:type="dxa"/>
-            </w:tcMar>
+            <w:tcW w:type="dxa" w:w="3216"/>
+            <w:shd w:fill="FFFFFF"/>
           </w:tcPr>
           <w:p>
-            <w:pPr>
-              <w:jc w:val="center"/>
-            </w:pPr>
             <w:r>
               <w:rPr>
-                <w:rFonts w:ascii="Times New Roman" w:hAnsi="Times New Roman" w:eastAsia="ＭＳ 明朝" w:cs="Times New Roman" w:eastAsiaTheme="minorEastAsia" w:csTheme="minorBidi"/>
-                <w:sz w:val="22"/>
-                <w:szCs w:val="22"/>
+                <w:rFonts w:ascii="Calibri" w:hAnsi="Calibri"/>
+                <w:sz w:val="20"/>
               </w:rPr>
-              <w:t>So sánh phương pháp đề xuất với baseline</w:t>
-            </w:r>
-          </w:p>
-        </w:tc>
-      </w:tr>
-      <w:tr>
-        <w:tc>
-          <w:tcPr>
-            <w:tcW w:w="680" w:type="dxa"/>
-            <w:tcBorders>
-              <w:top w:val="single" w:sz="4" w:space="0" w:color="auto"/>
-              <w:left w:val="single" w:sz="4" w:space="0" w:color="auto"/>
-              <w:bottom w:val="single" w:sz="4" w:space="0" w:color="auto"/>
-              <w:right w:val="single" w:sz="4" w:space="0" w:color="auto"/>
-            </w:tcBorders>
-            <w:tcMar>
-              <w:top w:w="0" w:type="dxa"/>
-              <w:left w:w="108" w:type="dxa"/>
-              <w:bottom w:w="0" w:type="dxa"/>
-              <w:right w:w="108" w:type="dxa"/>
-            </w:tcMar>
-          </w:tcPr>
-          <w:p>
-            <w:pPr>
-              <w:jc w:val="center"/>
-            </w:pPr>
-            <w:r>
-              <w:rPr>
-                <w:rFonts w:ascii="Times New Roman" w:hAnsi="Times New Roman" w:eastAsia="ＭＳ 明朝" w:cs="Times New Roman" w:eastAsiaTheme="minorEastAsia" w:csTheme="minorBidi"/>
-                <w:sz w:val="22"/>
-                <w:szCs w:val="22"/>
-              </w:rPr>
-              <w:t>3</w:t>
-            </w:r>
-          </w:p>
-        </w:tc>
-        <w:tc>
-          <w:tcPr>
-            <w:tcW w:w="5102" w:type="dxa"/>
-            <w:tcBorders>
-              <w:top w:val="single" w:sz="4" w:space="0" w:color="auto"/>
-              <w:left w:val="single" w:sz="4" w:space="0" w:color="auto"/>
-              <w:bottom w:val="single" w:sz="4" w:space="0" w:color="auto"/>
-              <w:right w:val="single" w:sz="4" w:space="0" w:color="auto"/>
-            </w:tcBorders>
-            <w:tcMar>
-              <w:top w:w="0" w:type="dxa"/>
-              <w:left w:w="108" w:type="dxa"/>
-              <w:bottom w:w="0" w:type="dxa"/>
-              <w:right w:w="108" w:type="dxa"/>
-            </w:tcMar>
-          </w:tcPr>
-          <w:p>
-            <w:pPr>
-              <w:jc w:val="center"/>
-            </w:pPr>
-            <w:r>
-              <w:rPr>
-                <w:rFonts w:ascii="Times New Roman" w:hAnsi="Times New Roman" w:eastAsia="ＭＳ 明朝" w:cs="Times New Roman" w:eastAsiaTheme="minorEastAsia" w:csTheme="minorBidi"/>
-                <w:sz w:val="22"/>
-                <w:szCs w:val="22"/>
-              </w:rPr>
-              <w:t>Triển khai trên NVIDIA Jetson (real federated)</w:t>
-            </w:r>
-            <w:r>
-              <w:br w:type="textWrapping"/>
-            </w:r>
-            <w:r>
-              <w:rPr>
-                <w:rFonts w:ascii="Times New Roman" w:hAnsi="Times New Roman" w:eastAsia="ＭＳ 明朝" w:cs="Times New Roman" w:eastAsiaTheme="minorEastAsia" w:csTheme="minorBidi"/>
-                <w:sz w:val="22"/>
-                <w:szCs w:val="22"/>
-              </w:rPr>
-              <w:t>với chiến lược cho kết quả tốt nhất ở bước 2</w:t>
-            </w:r>
-          </w:p>
-        </w:tc>
-        <w:tc>
-          <w:tcPr>
-            <w:tcW w:w="3402" w:type="dxa"/>
-            <w:tcBorders>
-              <w:top w:val="single" w:sz="4" w:space="0" w:color="auto"/>
-              <w:left w:val="single" w:sz="4" w:space="0" w:color="auto"/>
-              <w:bottom w:val="single" w:sz="4" w:space="0" w:color="auto"/>
-              <w:right w:val="single" w:sz="4" w:space="0" w:color="auto"/>
-            </w:tcBorders>
-            <w:tcMar>
-              <w:top w:w="0" w:type="dxa"/>
-              <w:left w:w="108" w:type="dxa"/>
-              <w:bottom w:w="0" w:type="dxa"/>
-              <w:right w:w="108" w:type="dxa"/>
-            </w:tcMar>
-          </w:tcPr>
-          <w:p>
-            <w:pPr>
-              <w:jc w:val="center"/>
-            </w:pPr>
-            <w:r>
-              <w:rPr>
-                <w:rFonts w:ascii="Times New Roman" w:hAnsi="Times New Roman" w:eastAsia="ＭＳ 明朝" w:cs="Times New Roman" w:eastAsiaTheme="minorEastAsia" w:csTheme="minorBidi"/>
-                <w:sz w:val="22"/>
-                <w:szCs w:val="22"/>
-              </w:rPr>
-              <w:t>Đánh giá thực tế trên edge device</w:t>
+              <w:t>Đánh giá hiệu quả khắc phục hiện tượng Client Drift trên dữ liệu y tế Non-IID so với FedAvg/FedProx.</w:t>
             </w:r>
           </w:p>
         </w:tc>
       </w:tr>
     </w:tbl>
+    <w:p/>
     <w:p>
       <w:pPr>
-        <w:spacing w:after="200" w:line="276" w:lineRule="auto"/>
-      </w:pPr>
-    </w:p>
-    <w:p>
-      <w:pPr>
-        <w:jc w:val="center"/>
+        <w:spacing w:before="160"/>
       </w:pPr>
       <w:r>
         <w:rPr>
-          <w:rFonts w:ascii="Times New Roman" w:hAnsi="Times New Roman" w:eastAsia="ＭＳ 明朝" w:cs="Times New Roman" w:eastAsiaTheme="minorEastAsia" w:csTheme="minorBidi"/>
+          <w:b/>
           <w:i/>
-          <w:iCs/>
-          <w:color w:val="505050"/>
-          <w:sz w:val="22"/>
-          <w:szCs w:val="22"/>
+          <w:color w:val="1F497D"/>
         </w:rPr>
-        <w:t>Kính mong Thầy/Cô cho ý kiến về hướng đề xuất trên, đặc biệt về tính phù hợp của việc sử dụng kết quả FedAvg/FedProx từ paper làm cơ sở đối chiếu và các phương pháp đề xuất (FedBN, FedNova, SCAFFOLD).</w:t>
+        <w:t>Kính mong Thầy/Cô và Hội đồng cho ý kiến chỉ đạo về hướng giải trình và các bước thực nghiệm tiếp theo của đề tài!</w:t>
       </w:r>
     </w:p>
     <w:sectPr>
       <w:pgSz w:w="12240" w:h="15840"/>
-      <w:pgMar w:top="1417" w:right="1134" w:bottom="1417" w:left="1701" w:header="720" w:footer="720" w:gutter="0"/>
+      <w:pgMar w:top="1152" w:right="1296" w:bottom="1152" w:left="1296" w:header="720" w:footer="720" w:gutter="0"/>
+      <w:cols w:space="720"/>
       <w:docGrid w:linePitch="360"/>
     </w:sectPr>
   </w:body>

</xml_diff>